<commit_message>
update changes in the practical files.
</commit_message>
<xml_diff>
--- a/25DCE014-FDSA_Practical-1.docx
+++ b/25DCE014-FDSA_Practical-1.docx
@@ -1,6 +1,6 @@
 
 <file path=word/document.xml><?xml version="1.0" encoding="utf-8"?>
-<w:document xmlns:wpc="http://schemas.microsoft.com/office/word/2010/wordprocessingCanvas" xmlns:cx="http://schemas.microsoft.com/office/drawing/2014/chartex" xmlns:cx1="http://schemas.microsoft.com/office/drawing/2015/9/8/chartex" xmlns:cx2="http://schemas.microsoft.com/office/drawing/2015/10/21/chartex" xmlns:cx3="http://schemas.microsoft.com/office/drawing/2016/5/9/chartex" xmlns:cx4="http://schemas.microsoft.com/office/drawing/2016/5/10/chartex" xmlns:cx5="http://schemas.microsoft.com/office/drawing/2016/5/11/chartex" xmlns:cx6="http://schemas.microsoft.com/office/drawing/2016/5/12/chartex" xmlns:cx7="http://schemas.microsoft.com/office/drawing/2016/5/13/chartex" xmlns:cx8="http://schemas.microsoft.com/office/drawing/2016/5/14/chartex" xmlns:mc="http://schemas.openxmlformats.org/markup-compatibility/2006" xmlns:aink="http://schemas.microsoft.com/office/drawing/2016/ink" xmlns:am3d="http://schemas.microsoft.com/office/drawing/2017/model3d" xmlns:o="urn:schemas-microsoft-com:office:office" xmlns:oel="http://schemas.microsoft.com/office/2019/extlst" xmlns:r="http://schemas.openxmlformats.org/officeDocument/2006/relationships" xmlns:m="http://schemas.openxmlformats.org/officeDocument/2006/math" xmlns:v="urn:schemas-microsoft-com:vml" xmlns:wp14="http://schemas.microsoft.com/office/word/2010/wordprocessingDrawing" xmlns:wp="http://schemas.openxmlformats.org/drawingml/2006/wordprocessingDrawing" xmlns:w10="urn:schemas-microsoft-com:office:word" xmlns:w="http://schemas.openxmlformats.org/wordprocessingml/2006/main" xmlns:w14="http://schemas.microsoft.com/office/word/2010/wordml" xmlns:w15="http://schemas.microsoft.com/office/word/2012/wordml" xmlns:w16cei="http://schemas.microsoft.com/office/word/2026/wordml/cei" xmlns:w16cex="http://schemas.microsoft.com/office/word/2018/wordml/cex" xmlns:w16cid="http://schemas.microsoft.com/office/word/2016/wordml/cid" xmlns:w16="http://schemas.microsoft.com/office/word/2018/wordml" xmlns:w16du="http://schemas.microsoft.com/office/word/2023/wordml/word16du" xmlns:w16sdtdh="http://schemas.microsoft.com/office/word/2020/wordml/sdtdatahash" xmlns:w16sdtfl="http://schemas.microsoft.com/office/word/2024/wordml/sdtformatlock" xmlns:w16se="http://schemas.microsoft.com/office/word/2015/wordml/symex" xmlns:wpg="http://schemas.microsoft.com/office/word/2010/wordprocessingGroup" xmlns:wpi="http://schemas.microsoft.com/office/word/2010/wordprocessingInk" xmlns:wne="http://schemas.microsoft.com/office/word/2006/wordml" xmlns:wps="http://schemas.microsoft.com/office/word/2010/wordprocessingShape" mc:Ignorable="w14 w15 w16se w16cid w16 w16cex w16sdtdh w16sdtfl w16du wp14">
+<w:document xmlns:wpc="http://schemas.microsoft.com/office/word/2010/wordprocessingCanvas" xmlns:cx="http://schemas.microsoft.com/office/drawing/2014/chartex" xmlns:cx1="http://schemas.microsoft.com/office/drawing/2015/9/8/chartex" xmlns:cx2="http://schemas.microsoft.com/office/drawing/2015/10/21/chartex" xmlns:cx3="http://schemas.microsoft.com/office/drawing/2016/5/9/chartex" xmlns:cx4="http://schemas.microsoft.com/office/drawing/2016/5/10/chartex" xmlns:cx5="http://schemas.microsoft.com/office/drawing/2016/5/11/chartex" xmlns:cx6="http://schemas.microsoft.com/office/drawing/2016/5/12/chartex" xmlns:cx7="http://schemas.microsoft.com/office/drawing/2016/5/13/chartex" xmlns:cx8="http://schemas.microsoft.com/office/drawing/2016/5/14/chartex" xmlns:mc="http://schemas.openxmlformats.org/markup-compatibility/2006" xmlns:o="urn:schemas-microsoft-com:office:office" xmlns:r="http://schemas.openxmlformats.org/officeDocument/2006/relationships" xmlns:m="http://schemas.openxmlformats.org/officeDocument/2006/math" xmlns:v="urn:schemas-microsoft-com:vml" xmlns:wp14="http://schemas.microsoft.com/office/word/2010/wordprocessingDrawing" xmlns:wp="http://schemas.openxmlformats.org/drawingml/2006/wordprocessingDrawing" xmlns:w="http://schemas.openxmlformats.org/wordprocessingml/2006/main" xmlns:w14="http://schemas.microsoft.com/office/word/2010/wordml" xmlns:w10="urn:schemas-microsoft-com:office:word" xmlns:w15="http://schemas.microsoft.com/office/word/2012/wordml" xmlns:wpg="http://schemas.microsoft.com/office/word/2010/wordprocessingGroup" xmlns:wpi="http://schemas.microsoft.com/office/word/2010/wordprocessingInk" xmlns:wne="http://schemas.microsoft.com/office/word/2006/wordml" xmlns:wps="http://schemas.microsoft.com/office/word/2010/wordprocessingShape" xmlns:wpsCustomData="http://www.wps.cn/officeDocument/2013/wpsCustomData" mc:Ignorable="w14 w15 wp14">
   <w:body>
     <w:p>
       <w:pPr>
@@ -16,10 +16,9 @@
       <w:r>
         <w:rPr>
           <w:rFonts w:ascii="Times New Roman" w:hAnsi="Times New Roman" w:cs="Times New Roman"/>
-          <w:noProof/>
         </w:rPr>
         <w:drawing>
-          <wp:anchor distT="0" distB="0" distL="114300" distR="114300" simplePos="0" relativeHeight="251659264" behindDoc="0" locked="0" layoutInCell="1" allowOverlap="1" wp14:anchorId="02534E6B" wp14:editId="02534E6C">
+          <wp:anchor distT="0" distB="0" distL="114300" distR="114300" simplePos="0" relativeHeight="251659264" behindDoc="0" locked="0" layoutInCell="1" allowOverlap="1">
             <wp:simplePos x="0" y="0"/>
             <wp:positionH relativeFrom="margin">
               <wp:align>right</wp:align>
@@ -44,7 +43,7 @@
                     </pic:cNvPicPr>
                   </pic:nvPicPr>
                   <pic:blipFill>
-                    <a:blip r:embed="rId7" cstate="print">
+                    <a:blip r:embed="rId8" cstate="print">
                       <a:extLst>
                         <a:ext uri="{28A0092B-C50C-407E-A947-70E740481C1C}">
                           <a14:useLocalDpi xmlns:a14="http://schemas.microsoft.com/office/drawing/2010/main" val="0"/>
@@ -176,17 +175,7 @@
           <w:sz w:val="28"/>
           <w:szCs w:val="28"/>
         </w:rPr>
-        <w:t xml:space="preserve">DEPARTMENT OF </w:t>
-      </w:r>
-      <w:r>
-        <w:rPr>
-          <w:rFonts w:ascii="Times New Roman" w:hAnsi="Times New Roman" w:cs="Times New Roman"/>
-          <w:b/>
-          <w:bCs/>
-          <w:sz w:val="28"/>
-          <w:szCs w:val="28"/>
-        </w:rPr>
-        <w:t>INFORMATION TECHNOLOGY</w:t>
+        <w:t>DEPARTMENT OF COMPUTER ENGINEERING</w:t>
       </w:r>
     </w:p>
     <w:p>
@@ -299,10 +288,9 @@
       <w:r>
         <w:rPr>
           <w:rFonts w:ascii="Times New Roman" w:hAnsi="Times New Roman" w:cs="Times New Roman"/>
-          <w:noProof/>
         </w:rPr>
         <w:drawing>
-          <wp:inline distT="0" distB="0" distL="0" distR="0" wp14:anchorId="02534E6D" wp14:editId="02534E6E">
+          <wp:inline distT="0" distB="0" distL="0" distR="0">
             <wp:extent cx="2395855" cy="2367280"/>
             <wp:effectExtent l="0" t="0" r="4445" b="0"/>
             <wp:docPr id="1584521611" name="Picture 4" descr="AKedOLQ0VvvuLk4YfO1AmhjgDKloISlfQbqcu5NfL5EH=s900-c-k-c0x00ffffff-no-rj"/>
@@ -319,7 +307,7 @@
                     </pic:cNvPicPr>
                   </pic:nvPicPr>
                   <pic:blipFill>
-                    <a:blip r:embed="rId8">
+                    <a:blip r:embed="rId9">
                       <a:extLst>
                         <a:ext uri="{28A0092B-C50C-407E-A947-70E740481C1C}">
                           <a14:useLocalDpi xmlns:a14="http://schemas.microsoft.com/office/drawing/2010/main" val="0"/>
@@ -376,7 +364,6 @@
           <w:sz w:val="32"/>
           <w:szCs w:val="32"/>
         </w:rPr>
-        <w:lastRenderedPageBreak/>
         <w:t>Practical 1: Array Operations: Traversal, Rotation, and Frequency Analysis</w:t>
       </w:r>
     </w:p>
@@ -512,20 +499,8 @@
           <w:sz w:val="28"/>
           <w:szCs w:val="28"/>
         </w:rPr>
-        <w:t xml:space="preserve">Problem </w:t>
-      </w:r>
-      <w:proofErr w:type="gramStart"/>
-      <w:r>
-        <w:rPr>
-          <w:rFonts w:ascii="Times New Roman" w:hAnsi="Times New Roman" w:cs="Times New Roman"/>
-          <w:b/>
-          <w:bCs/>
-          <w:sz w:val="28"/>
-          <w:szCs w:val="28"/>
-        </w:rPr>
-        <w:t>1 :</w:t>
-      </w:r>
-      <w:proofErr w:type="gramEnd"/>
+        <w:t>Problem 1 :</w:t>
+      </w:r>
     </w:p>
     <w:p>
       <w:pPr>
@@ -586,16 +561,17 @@
           <w:color w:val="156082" w:themeColor="accent1"/>
           <w:sz w:val="28"/>
           <w:szCs w:val="28"/>
+          <w:u w:val="single"/>
           <w14:shadow w14:blurRad="38100" w14:dist="25400" w14:dir="5400000" w14:sx="100000" w14:sy="100000" w14:kx="0" w14:ky="0" w14:algn="ctr">
             <w14:srgbClr w14:val="6E747A">
               <w14:alpha w14:val="57000"/>
             </w14:srgbClr>
           </w14:shadow>
-          <w14:textOutline w14:w="0" w14:cap="flat" w14:cmpd="sng" w14:algn="ctr">
-            <w14:noFill/>
-            <w14:prstDash w14:val="solid"/>
-            <w14:round/>
-          </w14:textOutline>
+          <w14:textFill>
+            <w14:solidFill>
+              <w14:schemeClr w14:val="accent1"/>
+            </w14:solidFill>
+          </w14:textFill>
         </w:rPr>
       </w:pPr>
       <w:r>
@@ -605,16 +581,17 @@
           <w:color w:val="156082" w:themeColor="accent1"/>
           <w:sz w:val="28"/>
           <w:szCs w:val="28"/>
+          <w:u w:val="single"/>
           <w14:shadow w14:blurRad="38100" w14:dist="25400" w14:dir="5400000" w14:sx="100000" w14:sy="100000" w14:kx="0" w14:ky="0" w14:algn="ctr">
             <w14:srgbClr w14:val="6E747A">
               <w14:alpha w14:val="57000"/>
             </w14:srgbClr>
           </w14:shadow>
-          <w14:textOutline w14:w="0" w14:cap="flat" w14:cmpd="sng" w14:algn="ctr">
-            <w14:noFill/>
-            <w14:prstDash w14:val="solid"/>
-            <w14:round/>
-          </w14:textOutline>
+          <w14:textFill>
+            <w14:solidFill>
+              <w14:schemeClr w14:val="accent1"/>
+            </w14:solidFill>
+          </w14:textFill>
         </w:rPr>
         <w:t>https://github.com/yakshu205/DSA/tree/bdbf7674f4d1ff4daa06066e17aff49530df5d6e/Sorting%20algo/practical-1</w:t>
       </w:r>
@@ -661,8 +638,8 @@
           <w:szCs w:val="28"/>
         </w:rPr>
         <w:drawing>
-          <wp:inline distT="0" distB="0" distL="0" distR="0" wp14:anchorId="796A677C" wp14:editId="0210FB3C">
-            <wp:extent cx="5456393" cy="2278577"/>
+          <wp:inline distT="0" distB="0" distL="0" distR="0">
+            <wp:extent cx="5455920" cy="2278380"/>
             <wp:effectExtent l="0" t="0" r="0" b="7620"/>
             <wp:docPr id="1576952359" name="Picture 1"/>
             <wp:cNvGraphicFramePr>
@@ -672,11 +649,13 @@
               <a:graphicData uri="http://schemas.openxmlformats.org/drawingml/2006/picture">
                 <pic:pic xmlns:pic="http://schemas.openxmlformats.org/drawingml/2006/picture">
                   <pic:nvPicPr>
-                    <pic:cNvPr id="1576952359" name=""/>
-                    <pic:cNvPicPr/>
+                    <pic:cNvPr id="1576952359" name="Picture 1"/>
+                    <pic:cNvPicPr>
+                      <a:picLocks noChangeAspect="1"/>
+                    </pic:cNvPicPr>
                   </pic:nvPicPr>
                   <pic:blipFill>
-                    <a:blip r:embed="rId9"/>
+                    <a:blip r:embed="rId10"/>
                     <a:stretch>
                       <a:fillRect/>
                     </a:stretch>
@@ -721,14 +700,14 @@
     </w:p>
     <w:p>
       <w:pPr>
-        <w:pStyle w:val="NormalWeb"/>
+        <w:pStyle w:val="20"/>
       </w:pPr>
       <w:r>
         <w:t xml:space="preserve">One of the main challenges in this problem is handling a large number of rotations efficiently. If the leftmost item is moved to the end for every hour, the program may need to perform millions of rotations when the value of </w:t>
       </w:r>
       <w:r>
         <w:rPr>
-          <w:rStyle w:val="Strong"/>
+          <w:rStyle w:val="21"/>
         </w:rPr>
         <w:t>h</w:t>
       </w:r>
@@ -817,20 +796,8 @@
           <w:sz w:val="28"/>
           <w:szCs w:val="28"/>
         </w:rPr>
-        <w:t xml:space="preserve">Problem </w:t>
-      </w:r>
-      <w:proofErr w:type="gramStart"/>
-      <w:r>
-        <w:rPr>
-          <w:rFonts w:ascii="Times New Roman" w:hAnsi="Times New Roman" w:cs="Times New Roman"/>
-          <w:b/>
-          <w:bCs/>
-          <w:sz w:val="28"/>
-          <w:szCs w:val="28"/>
-        </w:rPr>
-        <w:t>2 :</w:t>
-      </w:r>
-      <w:proofErr w:type="gramEnd"/>
+        <w:t>Problem 2 :</w:t>
+      </w:r>
     </w:p>
     <w:p>
       <w:pPr>
@@ -891,16 +858,17 @@
           <w:color w:val="156082" w:themeColor="accent1"/>
           <w:sz w:val="28"/>
           <w:szCs w:val="28"/>
+          <w:u w:val="single"/>
           <w14:shadow w14:blurRad="38100" w14:dist="25400" w14:dir="5400000" w14:sx="100000" w14:sy="100000" w14:kx="0" w14:ky="0" w14:algn="ctr">
             <w14:srgbClr w14:val="6E747A">
               <w14:alpha w14:val="57000"/>
             </w14:srgbClr>
           </w14:shadow>
-          <w14:textOutline w14:w="0" w14:cap="flat" w14:cmpd="sng" w14:algn="ctr">
-            <w14:noFill/>
-            <w14:prstDash w14:val="solid"/>
-            <w14:round/>
-          </w14:textOutline>
+          <w14:textFill>
+            <w14:solidFill>
+              <w14:schemeClr w14:val="accent1"/>
+            </w14:solidFill>
+          </w14:textFill>
         </w:rPr>
       </w:pPr>
       <w:r>
@@ -910,16 +878,17 @@
           <w:color w:val="156082" w:themeColor="accent1"/>
           <w:sz w:val="28"/>
           <w:szCs w:val="28"/>
+          <w:u w:val="single"/>
           <w14:shadow w14:blurRad="38100" w14:dist="25400" w14:dir="5400000" w14:sx="100000" w14:sy="100000" w14:kx="0" w14:ky="0" w14:algn="ctr">
             <w14:srgbClr w14:val="6E747A">
               <w14:alpha w14:val="57000"/>
             </w14:srgbClr>
           </w14:shadow>
-          <w14:textOutline w14:w="0" w14:cap="flat" w14:cmpd="sng" w14:algn="ctr">
-            <w14:noFill/>
-            <w14:prstDash w14:val="solid"/>
-            <w14:round/>
-          </w14:textOutline>
+          <w14:textFill>
+            <w14:solidFill>
+              <w14:schemeClr w14:val="accent1"/>
+            </w14:solidFill>
+          </w14:textFill>
         </w:rPr>
         <w:t>https://github.com/yakshu205/DSA/tree/bdbf7674f4d1ff4daa06066e17aff49530df5d6e/Sorting%20algo/practical-1</w:t>
       </w:r>
@@ -966,7 +935,7 @@
           <w:szCs w:val="28"/>
         </w:rPr>
         <w:drawing>
-          <wp:inline distT="0" distB="0" distL="0" distR="0" wp14:anchorId="0506F3F9" wp14:editId="0AFA67A9">
+          <wp:inline distT="0" distB="0" distL="0" distR="0">
             <wp:extent cx="5731510" cy="783590"/>
             <wp:effectExtent l="0" t="0" r="2540" b="0"/>
             <wp:docPr id="1914180090" name="Picture 1"/>
@@ -977,11 +946,13 @@
               <a:graphicData uri="http://schemas.openxmlformats.org/drawingml/2006/picture">
                 <pic:pic xmlns:pic="http://schemas.openxmlformats.org/drawingml/2006/picture">
                   <pic:nvPicPr>
-                    <pic:cNvPr id="1914180090" name=""/>
-                    <pic:cNvPicPr/>
+                    <pic:cNvPr id="1914180090" name="Picture 1"/>
+                    <pic:cNvPicPr>
+                      <a:picLocks noChangeAspect="1"/>
+                    </pic:cNvPicPr>
                   </pic:nvPicPr>
                   <pic:blipFill>
-                    <a:blip r:embed="rId10"/>
+                    <a:blip r:embed="rId11"/>
                     <a:stretch>
                       <a:fillRect/>
                     </a:stretch>
@@ -1038,7 +1009,7 @@
     </w:p>
     <w:p>
       <w:pPr>
-        <w:pStyle w:val="NormalWeb"/>
+        <w:pStyle w:val="20"/>
       </w:pPr>
       <w:r>
         <w:t>The main challenge is efficiently identifying book IDs that appear more than once in a large borrowing log. Using a nested loop to compare each book ID with every other ID would require a large number of comparisons, making the solution slow and inefficient for datasets containing thousands of records.</w:t>
@@ -1046,35 +1017,34 @@
     </w:p>
     <w:p>
       <w:pPr>
-        <w:pStyle w:val="NormalWeb"/>
-      </w:pPr>
-    </w:p>
-    <w:p>
-      <w:pPr>
-        <w:jc w:val="both"/>
-        <w:rPr>
-          <w:rFonts w:ascii="Times New Roman" w:hAnsi="Times New Roman" w:cs="Times New Roman"/>
-          <w:b/>
-          <w:bCs/>
-          <w:sz w:val="28"/>
-          <w:szCs w:val="28"/>
-        </w:rPr>
-      </w:pPr>
-      <w:r>
-        <w:rPr>
-          <w:rFonts w:ascii="Times New Roman" w:hAnsi="Times New Roman" w:cs="Times New Roman"/>
-          <w:b/>
-          <w:bCs/>
-          <w:sz w:val="28"/>
-          <w:szCs w:val="28"/>
-        </w:rPr>
-        <w:lastRenderedPageBreak/>
+        <w:pStyle w:val="20"/>
+      </w:pPr>
+    </w:p>
+    <w:p>
+      <w:pPr>
+        <w:jc w:val="both"/>
+        <w:rPr>
+          <w:rFonts w:ascii="Times New Roman" w:hAnsi="Times New Roman" w:cs="Times New Roman"/>
+          <w:b/>
+          <w:bCs/>
+          <w:sz w:val="28"/>
+          <w:szCs w:val="28"/>
+        </w:rPr>
+      </w:pPr>
+      <w:r>
+        <w:rPr>
+          <w:rFonts w:ascii="Times New Roman" w:hAnsi="Times New Roman" w:cs="Times New Roman"/>
+          <w:b/>
+          <w:bCs/>
+          <w:sz w:val="28"/>
+          <w:szCs w:val="28"/>
+        </w:rPr>
         <w:t>Outcome/Conclusion:</w:t>
       </w:r>
     </w:p>
     <w:p>
       <w:pPr>
-        <w:pStyle w:val="NormalWeb"/>
+        <w:pStyle w:val="20"/>
       </w:pPr>
       <w:r>
         <w:t>To solve this problem efficiently, a frequency-counting approach can be used. Each book ID is scanned and its occurrence count is stored in a hash map or similar data structure. After counting the frequencies, the IDs with a count greater than one are printed. This approach requires only a small number of passes through the data and works efficiently even for very large borrowing logs.</w:t>
@@ -1082,46 +1052,34 @@
     </w:p>
     <w:p>
       <w:pPr>
-        <w:pStyle w:val="NormalWeb"/>
-      </w:pPr>
-    </w:p>
-    <w:p>
-      <w:pPr>
-        <w:jc w:val="both"/>
-        <w:rPr>
-          <w:rFonts w:ascii="Times New Roman" w:hAnsi="Times New Roman" w:cs="Times New Roman"/>
-          <w:b/>
-          <w:bCs/>
-          <w:sz w:val="28"/>
-          <w:szCs w:val="28"/>
-        </w:rPr>
-      </w:pPr>
-      <w:r>
-        <w:rPr>
-          <w:rFonts w:ascii="Times New Roman" w:hAnsi="Times New Roman" w:cs="Times New Roman"/>
-          <w:b/>
-          <w:bCs/>
-          <w:sz w:val="28"/>
-          <w:szCs w:val="28"/>
-        </w:rPr>
-        <w:t xml:space="preserve">Problem </w:t>
-      </w:r>
-      <w:proofErr w:type="gramStart"/>
-      <w:r>
-        <w:rPr>
-          <w:rFonts w:ascii="Times New Roman" w:hAnsi="Times New Roman" w:cs="Times New Roman"/>
-          <w:b/>
-          <w:bCs/>
-          <w:sz w:val="28"/>
-          <w:szCs w:val="28"/>
-        </w:rPr>
-        <w:t>3 :</w:t>
-      </w:r>
-      <w:proofErr w:type="gramEnd"/>
-    </w:p>
-    <w:p>
-      <w:pPr>
-        <w:pStyle w:val="BodyText"/>
+        <w:pStyle w:val="20"/>
+      </w:pPr>
+    </w:p>
+    <w:p>
+      <w:pPr>
+        <w:jc w:val="both"/>
+        <w:rPr>
+          <w:rFonts w:ascii="Times New Roman" w:hAnsi="Times New Roman" w:cs="Times New Roman"/>
+          <w:b/>
+          <w:bCs/>
+          <w:sz w:val="28"/>
+          <w:szCs w:val="28"/>
+        </w:rPr>
+      </w:pPr>
+      <w:r>
+        <w:rPr>
+          <w:rFonts w:ascii="Times New Roman" w:hAnsi="Times New Roman" w:cs="Times New Roman"/>
+          <w:b/>
+          <w:bCs/>
+          <w:sz w:val="28"/>
+          <w:szCs w:val="28"/>
+        </w:rPr>
+        <w:t>Problem 3 :</w:t>
+      </w:r>
+    </w:p>
+    <w:p>
+      <w:pPr>
+        <w:pStyle w:val="13"/>
         <w:spacing w:before="195" w:line="280" w:lineRule="auto"/>
         <w:ind w:left="25" w:right="10"/>
         <w:jc w:val="both"/>
@@ -1260,16 +1218,17 @@
           <w:color w:val="156082" w:themeColor="accent1"/>
           <w:sz w:val="28"/>
           <w:szCs w:val="28"/>
+          <w:u w:val="single"/>
           <w14:shadow w14:blurRad="38100" w14:dist="25400" w14:dir="5400000" w14:sx="100000" w14:sy="100000" w14:kx="0" w14:ky="0" w14:algn="ctr">
             <w14:srgbClr w14:val="6E747A">
               <w14:alpha w14:val="57000"/>
             </w14:srgbClr>
           </w14:shadow>
-          <w14:textOutline w14:w="0" w14:cap="flat" w14:cmpd="sng" w14:algn="ctr">
-            <w14:noFill/>
-            <w14:prstDash w14:val="solid"/>
-            <w14:round/>
-          </w14:textOutline>
+          <w14:textFill>
+            <w14:solidFill>
+              <w14:schemeClr w14:val="accent1"/>
+            </w14:solidFill>
+          </w14:textFill>
         </w:rPr>
       </w:pPr>
       <w:r>
@@ -1279,16 +1238,17 @@
           <w:color w:val="156082" w:themeColor="accent1"/>
           <w:sz w:val="28"/>
           <w:szCs w:val="28"/>
+          <w:u w:val="single"/>
           <w14:shadow w14:blurRad="38100" w14:dist="25400" w14:dir="5400000" w14:sx="100000" w14:sy="100000" w14:kx="0" w14:ky="0" w14:algn="ctr">
             <w14:srgbClr w14:val="6E747A">
               <w14:alpha w14:val="57000"/>
             </w14:srgbClr>
           </w14:shadow>
-          <w14:textOutline w14:w="0" w14:cap="flat" w14:cmpd="sng" w14:algn="ctr">
-            <w14:noFill/>
-            <w14:prstDash w14:val="solid"/>
-            <w14:round/>
-          </w14:textOutline>
+          <w14:textFill>
+            <w14:solidFill>
+              <w14:schemeClr w14:val="accent1"/>
+            </w14:solidFill>
+          </w14:textFill>
         </w:rPr>
         <w:t>https://github.com/yakshu205/DSA/tree/bdbf7674f4d1ff4daa06066e17aff49530df5d6e/Sorting%20algo/practical-1</w:t>
       </w:r>
@@ -1347,8 +1307,8 @@
           <w:szCs w:val="28"/>
         </w:rPr>
         <w:drawing>
-          <wp:inline distT="0" distB="0" distL="0" distR="0" wp14:anchorId="3545A447" wp14:editId="4BBC0AF7">
-            <wp:extent cx="3962743" cy="1242168"/>
+          <wp:inline distT="0" distB="0" distL="0" distR="0">
+            <wp:extent cx="3962400" cy="1242060"/>
             <wp:effectExtent l="0" t="0" r="0" b="0"/>
             <wp:docPr id="80037922" name="Picture 1"/>
             <wp:cNvGraphicFramePr>
@@ -1358,11 +1318,13 @@
               <a:graphicData uri="http://schemas.openxmlformats.org/drawingml/2006/picture">
                 <pic:pic xmlns:pic="http://schemas.openxmlformats.org/drawingml/2006/picture">
                   <pic:nvPicPr>
-                    <pic:cNvPr id="80037922" name=""/>
-                    <pic:cNvPicPr/>
+                    <pic:cNvPr id="80037922" name="Picture 1"/>
+                    <pic:cNvPicPr>
+                      <a:picLocks noChangeAspect="1"/>
+                    </pic:cNvPicPr>
                   </pic:nvPicPr>
                   <pic:blipFill>
-                    <a:blip r:embed="rId11"/>
+                    <a:blip r:embed="rId12"/>
                     <a:stretch>
                       <a:fillRect/>
                     </a:stretch>
@@ -1407,7 +1369,7 @@
     </w:p>
     <w:p>
       <w:pPr>
-        <w:pStyle w:val="NormalWeb"/>
+        <w:pStyle w:val="20"/>
       </w:pPr>
       <w:r>
         <w:t>The main challenge is correctly identifying the longest word in the given sentence. Since a sentence may contain multiple words of different lengths, the program must compare the length of each word and keep track of the longest one found. Another challenge arises when two or more words have the same maximum length.</w:t>
@@ -1437,27 +1399,15 @@
     </w:p>
     <w:p>
       <w:pPr>
-        <w:pStyle w:val="NormalWeb"/>
-      </w:pPr>
-      <w:r>
-        <w:t xml:space="preserve">To solve this problem, the sentence is split into individual words, and each word is checked one by one. The length of each word is compared with the current longest word. If a longer word is found, it becomes the new longest word. In the case of two words having the same length, the current implementation keeps the first word encountered. This </w:t>
-      </w:r>
-      <w:proofErr w:type="spellStart"/>
-      <w:r>
-        <w:t>behavior</w:t>
-      </w:r>
-      <w:proofErr w:type="spellEnd"/>
-      <w:r>
-        <w:t xml:space="preserve"> is simple </w:t>
-      </w:r>
-      <w:r>
-        <w:lastRenderedPageBreak/>
-        <w:t>and consistent, though it can be modified to explicitly handle ties by displaying all longest words or selecting the last occurrence.</w:t>
-      </w:r>
-    </w:p>
-    <w:p>
-      <w:pPr>
-        <w:pStyle w:val="NormalWeb"/>
+        <w:pStyle w:val="20"/>
+      </w:pPr>
+      <w:r>
+        <w:t>To solve this problem, the sentence is split into individual words, and each word is checked one by one. The length of each word is compared with the current longest word. If a longer word is found, it becomes the new longest word. In the case of two words having the same length, the current implementation keeps the first word encountered. This behavior is simple and consistent, though it can be modified to explicitly handle ties by displaying all longest words or selecting the last occurrence.</w:t>
+      </w:r>
+    </w:p>
+    <w:p>
+      <w:pPr>
+        <w:pStyle w:val="20"/>
       </w:pPr>
     </w:p>
     <w:p>
@@ -1519,8 +1469,6 @@
           <w:szCs w:val="28"/>
         </w:rPr>
       </w:pPr>
-      <w:proofErr w:type="spellStart"/>
-      <w:proofErr w:type="gramStart"/>
       <w:r>
         <w:rPr>
           <w:rFonts w:ascii="Times New Roman" w:hAnsi="Times New Roman" w:cs="Times New Roman"/>
@@ -1537,17 +1485,7 @@
           <w:sz w:val="28"/>
           <w:szCs w:val="28"/>
         </w:rPr>
-        <w:t>The</w:t>
-      </w:r>
-      <w:proofErr w:type="spellEnd"/>
-      <w:proofErr w:type="gramEnd"/>
-      <w:r>
-        <w:rPr>
-          <w:rFonts w:ascii="Times New Roman" w:hAnsi="Times New Roman" w:cs="Times New Roman"/>
-          <w:sz w:val="28"/>
-          <w:szCs w:val="28"/>
-        </w:rPr>
-        <w:t xml:space="preserve"> display order repeats after n rotations because all items return to their original positions. Therefore, the first repetition occurs after n rotations.</w:t>
+        <w:t>The display order repeats after n rotations because all items return to their original positions. Therefore, the first repetition occurs after n rotations.</w:t>
       </w:r>
     </w:p>
     <w:p>
@@ -1587,8 +1525,6 @@
           <w:szCs w:val="28"/>
         </w:rPr>
       </w:pPr>
-      <w:proofErr w:type="spellStart"/>
-      <w:proofErr w:type="gramStart"/>
       <w:r>
         <w:rPr>
           <w:rFonts w:ascii="Times New Roman" w:hAnsi="Times New Roman" w:cs="Times New Roman"/>
@@ -1605,17 +1541,7 @@
           <w:sz w:val="28"/>
           <w:szCs w:val="28"/>
         </w:rPr>
-        <w:t>If</w:t>
-      </w:r>
-      <w:proofErr w:type="spellEnd"/>
-      <w:proofErr w:type="gramEnd"/>
-      <w:r>
-        <w:rPr>
-          <w:rFonts w:ascii="Times New Roman" w:hAnsi="Times New Roman" w:cs="Times New Roman"/>
-          <w:sz w:val="28"/>
-          <w:szCs w:val="28"/>
-        </w:rPr>
-        <w:t xml:space="preserve"> a book ID appears three times, it should be printed only once. The frequency map ensures this by checking counts instead of printing every occurrence.</w:t>
+        <w:t>If a book ID appears three times, it should be printed only once. The frequency map ensures this by checking counts instead of printing every occurrence.</w:t>
       </w:r>
     </w:p>
     <w:p>
@@ -1655,8 +1581,6 @@
           <w:szCs w:val="28"/>
         </w:rPr>
       </w:pPr>
-      <w:proofErr w:type="spellStart"/>
-      <w:proofErr w:type="gramStart"/>
       <w:r>
         <w:rPr>
           <w:rFonts w:ascii="Times New Roman" w:hAnsi="Times New Roman" w:cs="Times New Roman"/>
@@ -1673,38 +1597,30 @@
           <w:sz w:val="28"/>
           <w:szCs w:val="28"/>
         </w:rPr>
-        <w:t>If</w:t>
-      </w:r>
-      <w:proofErr w:type="spellEnd"/>
-      <w:proofErr w:type="gramEnd"/>
-      <w:r>
-        <w:rPr>
-          <w:rFonts w:ascii="Times New Roman" w:hAnsi="Times New Roman" w:cs="Times New Roman"/>
-          <w:sz w:val="28"/>
-          <w:szCs w:val="28"/>
-        </w:rPr>
-        <w:t xml:space="preserve"> punctuation should not be counted, remove punctuation from each word before calculating its length. This ensures accurate results.</w:t>
-      </w:r>
-    </w:p>
-    <w:p>
-      <w:pPr>
-        <w:jc w:val="both"/>
-        <w:rPr>
-          <w:rFonts w:ascii="Times New Roman" w:hAnsi="Times New Roman" w:cs="Times New Roman"/>
-          <w:sz w:val="28"/>
-          <w:szCs w:val="28"/>
-        </w:rPr>
-      </w:pPr>
-    </w:p>
-    <w:p>
-      <w:pPr>
-        <w:jc w:val="both"/>
-        <w:rPr>
-          <w:rFonts w:ascii="Times New Roman" w:hAnsi="Times New Roman" w:cs="Times New Roman"/>
-          <w:sz w:val="28"/>
-          <w:szCs w:val="28"/>
-        </w:rPr>
-      </w:pPr>
+        <w:t>If punctuation should not be counted, remove punctuation from each word before calculating its length. This ensures accurate results.</w:t>
+      </w:r>
+    </w:p>
+    <w:p>
+      <w:pPr>
+        <w:jc w:val="both"/>
+        <w:rPr>
+          <w:rFonts w:ascii="Times New Roman" w:hAnsi="Times New Roman" w:cs="Times New Roman"/>
+          <w:sz w:val="28"/>
+          <w:szCs w:val="28"/>
+        </w:rPr>
+      </w:pPr>
+    </w:p>
+    <w:p>
+      <w:pPr>
+        <w:jc w:val="both"/>
+        <w:rPr>
+          <w:rFonts w:ascii="Times New Roman" w:hAnsi="Times New Roman" w:cs="Times New Roman"/>
+          <w:sz w:val="28"/>
+          <w:szCs w:val="28"/>
+        </w:rPr>
+      </w:pPr>
+      <w:bookmarkStart w:id="1" w:name="_GoBack"/>
+      <w:bookmarkEnd w:id="1"/>
     </w:p>
     <w:p>
       <w:pPr>
@@ -1725,20 +1641,20 @@
       </w:pPr>
     </w:p>
     <w:sectPr>
-      <w:headerReference w:type="default" r:id="rId12"/>
-      <w:footerReference w:type="default" r:id="rId13"/>
+      <w:headerReference r:id="rId5" w:type="default"/>
+      <w:footerReference r:id="rId6" w:type="default"/>
       <w:pgSz w:w="11906" w:h="16838"/>
       <w:pgMar w:top="1440" w:right="1440" w:bottom="1440" w:left="1440" w:header="709" w:footer="709" w:gutter="0"/>
-      <w:cols w:space="708"/>
-      <w:docGrid w:linePitch="360"/>
+      <w:cols w:space="708" w:num="1"/>
+      <w:docGrid w:linePitch="360" w:charSpace="0"/>
     </w:sectPr>
   </w:body>
 </w:document>
 </file>
 
 <file path=word/endnotes.xml><?xml version="1.0" encoding="utf-8"?>
-<w:endnotes xmlns:wpc="http://schemas.microsoft.com/office/word/2010/wordprocessingCanvas" xmlns:cx="http://schemas.microsoft.com/office/drawing/2014/chartex" xmlns:cx1="http://schemas.microsoft.com/office/drawing/2015/9/8/chartex" xmlns:cx2="http://schemas.microsoft.com/office/drawing/2015/10/21/chartex" xmlns:cx3="http://schemas.microsoft.com/office/drawing/2016/5/9/chartex" xmlns:cx4="http://schemas.microsoft.com/office/drawing/2016/5/10/chartex" xmlns:cx5="http://schemas.microsoft.com/office/drawing/2016/5/11/chartex" xmlns:cx6="http://schemas.microsoft.com/office/drawing/2016/5/12/chartex" xmlns:cx7="http://schemas.microsoft.com/office/drawing/2016/5/13/chartex" xmlns:cx8="http://schemas.microsoft.com/office/drawing/2016/5/14/chartex" xmlns:mc="http://schemas.openxmlformats.org/markup-compatibility/2006" xmlns:aink="http://schemas.microsoft.com/office/drawing/2016/ink" xmlns:am3d="http://schemas.microsoft.com/office/drawing/2017/model3d" xmlns:o="urn:schemas-microsoft-com:office:office" xmlns:oel="http://schemas.microsoft.com/office/2019/extlst" xmlns:r="http://schemas.openxmlformats.org/officeDocument/2006/relationships" xmlns:m="http://schemas.openxmlformats.org/officeDocument/2006/math" xmlns:v="urn:schemas-microsoft-com:vml" xmlns:wp14="http://schemas.microsoft.com/office/word/2010/wordprocessingDrawing" xmlns:wp="http://schemas.openxmlformats.org/drawingml/2006/wordprocessingDrawing" xmlns:w10="urn:schemas-microsoft-com:office:word" xmlns:w="http://schemas.openxmlformats.org/wordprocessingml/2006/main" xmlns:w14="http://schemas.microsoft.com/office/word/2010/wordml" xmlns:w15="http://schemas.microsoft.com/office/word/2012/wordml" xmlns:w16cei="http://schemas.microsoft.com/office/word/2026/wordml/cei" xmlns:w16cex="http://schemas.microsoft.com/office/word/2018/wordml/cex" xmlns:w16cid="http://schemas.microsoft.com/office/word/2016/wordml/cid" xmlns:w16="http://schemas.microsoft.com/office/word/2018/wordml" xmlns:w16du="http://schemas.microsoft.com/office/word/2023/wordml/word16du" xmlns:w16sdtdh="http://schemas.microsoft.com/office/word/2020/wordml/sdtdatahash" xmlns:w16sdtfl="http://schemas.microsoft.com/office/word/2024/wordml/sdtformatlock" xmlns:w16se="http://schemas.microsoft.com/office/word/2015/wordml/symex" xmlns:wpg="http://schemas.microsoft.com/office/word/2010/wordprocessingGroup" xmlns:wpi="http://schemas.microsoft.com/office/word/2010/wordprocessingInk" xmlns:wne="http://schemas.microsoft.com/office/word/2006/wordml" xmlns:wps="http://schemas.microsoft.com/office/word/2010/wordprocessingShape" mc:Ignorable="w14 w15 w16se w16cid w16 w16cex w16sdtdh w16sdtfl w16du wp14">
-  <w:endnote w:type="separator" w:id="-1">
+<w:endnotes xmlns:wpc="http://schemas.microsoft.com/office/word/2010/wordprocessingCanvas" xmlns:mc="http://schemas.openxmlformats.org/markup-compatibility/2006" xmlns:o="urn:schemas-microsoft-com:office:office" xmlns:r="http://schemas.openxmlformats.org/officeDocument/2006/relationships" xmlns:m="http://schemas.openxmlformats.org/officeDocument/2006/math" xmlns:v="urn:schemas-microsoft-com:vml" xmlns:wp14="http://schemas.microsoft.com/office/word/2010/wordprocessingDrawing" xmlns:wp="http://schemas.openxmlformats.org/drawingml/2006/wordprocessingDrawing" xmlns:w="http://schemas.openxmlformats.org/wordprocessingml/2006/main" xmlns:w14="http://schemas.microsoft.com/office/word/2010/wordml" xmlns:w15="http://schemas.microsoft.com/office/word/2012/wordml" xmlns:w10="urn:schemas-microsoft-com:office:word" xmlns:wpg="http://schemas.microsoft.com/office/word/2010/wordprocessingGroup" xmlns:wpi="http://schemas.microsoft.com/office/word/2010/wordprocessingInk" xmlns:wne="http://schemas.microsoft.com/office/word/2006/wordml" xmlns:wps="http://schemas.microsoft.com/office/word/2010/wordprocessingShape" xmlns:wpsCustomData="http://www.wps.cn/officeDocument/2013/wpsCustomData" mc:Ignorable="w14 w15 wp14">
+  <w:endnote w:type="separator" w:id="0">
     <w:p>
       <w:pPr>
         <w:spacing w:line="240" w:lineRule="auto"/>
@@ -1748,7 +1664,7 @@
       </w:r>
     </w:p>
   </w:endnote>
-  <w:endnote w:type="continuationSeparator" w:id="0">
+  <w:endnote w:type="continuationSeparator" w:id="1">
     <w:p>
       <w:pPr>
         <w:spacing w:line="240" w:lineRule="auto"/>
@@ -1762,12 +1678,12 @@
 </file>
 
 <file path=word/footer1.xml><?xml version="1.0" encoding="utf-8"?>
-<w:ftr xmlns:wpc="http://schemas.microsoft.com/office/word/2010/wordprocessingCanvas" xmlns:cx="http://schemas.microsoft.com/office/drawing/2014/chartex" xmlns:cx1="http://schemas.microsoft.com/office/drawing/2015/9/8/chartex" xmlns:cx2="http://schemas.microsoft.com/office/drawing/2015/10/21/chartex" xmlns:cx3="http://schemas.microsoft.com/office/drawing/2016/5/9/chartex" xmlns:cx4="http://schemas.microsoft.com/office/drawing/2016/5/10/chartex" xmlns:cx5="http://schemas.microsoft.com/office/drawing/2016/5/11/chartex" xmlns:cx6="http://schemas.microsoft.com/office/drawing/2016/5/12/chartex" xmlns:cx7="http://schemas.microsoft.com/office/drawing/2016/5/13/chartex" xmlns:cx8="http://schemas.microsoft.com/office/drawing/2016/5/14/chartex" xmlns:mc="http://schemas.openxmlformats.org/markup-compatibility/2006" xmlns:aink="http://schemas.microsoft.com/office/drawing/2016/ink" xmlns:am3d="http://schemas.microsoft.com/office/drawing/2017/model3d" xmlns:o="urn:schemas-microsoft-com:office:office" xmlns:oel="http://schemas.microsoft.com/office/2019/extlst" xmlns:r="http://schemas.openxmlformats.org/officeDocument/2006/relationships" xmlns:m="http://schemas.openxmlformats.org/officeDocument/2006/math" xmlns:v="urn:schemas-microsoft-com:vml" xmlns:wp14="http://schemas.microsoft.com/office/word/2010/wordprocessingDrawing" xmlns:wp="http://schemas.openxmlformats.org/drawingml/2006/wordprocessingDrawing" xmlns:w10="urn:schemas-microsoft-com:office:word" xmlns:w="http://schemas.openxmlformats.org/wordprocessingml/2006/main" xmlns:w14="http://schemas.microsoft.com/office/word/2010/wordml" xmlns:w15="http://schemas.microsoft.com/office/word/2012/wordml" xmlns:w16cei="http://schemas.microsoft.com/office/word/2026/wordml/cei" xmlns:w16cex="http://schemas.microsoft.com/office/word/2018/wordml/cex" xmlns:w16cid="http://schemas.microsoft.com/office/word/2016/wordml/cid" xmlns:w16="http://schemas.microsoft.com/office/word/2018/wordml" xmlns:w16du="http://schemas.microsoft.com/office/word/2023/wordml/word16du" xmlns:w16sdtdh="http://schemas.microsoft.com/office/word/2020/wordml/sdtdatahash" xmlns:w16sdtfl="http://schemas.microsoft.com/office/word/2024/wordml/sdtformatlock" xmlns:w16se="http://schemas.microsoft.com/office/word/2015/wordml/symex" xmlns:wpg="http://schemas.microsoft.com/office/word/2010/wordprocessingGroup" xmlns:wpi="http://schemas.microsoft.com/office/word/2010/wordprocessingInk" xmlns:wne="http://schemas.microsoft.com/office/word/2006/wordml" xmlns:wps="http://schemas.microsoft.com/office/word/2010/wordprocessingShape" mc:Ignorable="w14 w15 w16se w16cid w16 w16cex w16sdtdh w16sdtfl w16du wp14">
+<w:ftr xmlns:wpc="http://schemas.microsoft.com/office/word/2010/wordprocessingCanvas" xmlns:mc="http://schemas.openxmlformats.org/markup-compatibility/2006" xmlns:o="urn:schemas-microsoft-com:office:office" xmlns:r="http://schemas.openxmlformats.org/officeDocument/2006/relationships" xmlns:m="http://schemas.openxmlformats.org/officeDocument/2006/math" xmlns:v="urn:schemas-microsoft-com:vml" xmlns:wp14="http://schemas.microsoft.com/office/word/2010/wordprocessingDrawing" xmlns:wp="http://schemas.openxmlformats.org/drawingml/2006/wordprocessingDrawing" xmlns:w10="urn:schemas-microsoft-com:office:word" xmlns:w="http://schemas.openxmlformats.org/wordprocessingml/2006/main" xmlns:w14="http://schemas.microsoft.com/office/word/2010/wordml" xmlns:w15="http://schemas.microsoft.com/office/word/2012/wordml" xmlns:wpg="http://schemas.microsoft.com/office/word/2010/wordprocessingGroup" xmlns:wpi="http://schemas.microsoft.com/office/word/2010/wordprocessingInk" xmlns:wne="http://schemas.microsoft.com/office/word/2006/wordml" xmlns:wps="http://schemas.microsoft.com/office/word/2010/wordprocessingShape" xmlns:wpsCustomData="http://www.wps.cn/officeDocument/2013/wpsCustomData" mc:Ignorable="w14 w15 wp14">
   <w:p>
     <w:pPr>
-      <w:pStyle w:val="Footer"/>
+      <w:pStyle w:val="17"/>
       <w:pBdr>
-        <w:top w:val="single" w:sz="4" w:space="1" w:color="D9D9D9" w:themeColor="background1" w:themeShade="D9"/>
+        <w:top w:val="single" w:color="D8D8D8" w:themeColor="background1" w:themeShade="D9" w:sz="4" w:space="1"/>
       </w:pBdr>
     </w:pPr>
     <w:r>
@@ -1777,7 +1693,7 @@
       <w:sdtPr>
         <w:id w:val="-1240943964"/>
         <w:docPartObj>
-          <w:docPartGallery w:val="AutoText"/>
+          <w:docPartGallery w:val="autotext"/>
         </w:docPartObj>
       </w:sdtPr>
       <w:sdtEndPr>
@@ -1820,28 +1736,28 @@
   </w:p>
   <w:p>
     <w:pPr>
-      <w:pStyle w:val="Footer"/>
+      <w:pStyle w:val="17"/>
     </w:pPr>
   </w:p>
 </w:ftr>
 </file>
 
 <file path=word/footnotes.xml><?xml version="1.0" encoding="utf-8"?>
-<w:footnotes xmlns:wpc="http://schemas.microsoft.com/office/word/2010/wordprocessingCanvas" xmlns:cx="http://schemas.microsoft.com/office/drawing/2014/chartex" xmlns:cx1="http://schemas.microsoft.com/office/drawing/2015/9/8/chartex" xmlns:cx2="http://schemas.microsoft.com/office/drawing/2015/10/21/chartex" xmlns:cx3="http://schemas.microsoft.com/office/drawing/2016/5/9/chartex" xmlns:cx4="http://schemas.microsoft.com/office/drawing/2016/5/10/chartex" xmlns:cx5="http://schemas.microsoft.com/office/drawing/2016/5/11/chartex" xmlns:cx6="http://schemas.microsoft.com/office/drawing/2016/5/12/chartex" xmlns:cx7="http://schemas.microsoft.com/office/drawing/2016/5/13/chartex" xmlns:cx8="http://schemas.microsoft.com/office/drawing/2016/5/14/chartex" xmlns:mc="http://schemas.openxmlformats.org/markup-compatibility/2006" xmlns:aink="http://schemas.microsoft.com/office/drawing/2016/ink" xmlns:am3d="http://schemas.microsoft.com/office/drawing/2017/model3d" xmlns:o="urn:schemas-microsoft-com:office:office" xmlns:oel="http://schemas.microsoft.com/office/2019/extlst" xmlns:r="http://schemas.openxmlformats.org/officeDocument/2006/relationships" xmlns:m="http://schemas.openxmlformats.org/officeDocument/2006/math" xmlns:v="urn:schemas-microsoft-com:vml" xmlns:wp14="http://schemas.microsoft.com/office/word/2010/wordprocessingDrawing" xmlns:wp="http://schemas.openxmlformats.org/drawingml/2006/wordprocessingDrawing" xmlns:w10="urn:schemas-microsoft-com:office:word" xmlns:w="http://schemas.openxmlformats.org/wordprocessingml/2006/main" xmlns:w14="http://schemas.microsoft.com/office/word/2010/wordml" xmlns:w15="http://schemas.microsoft.com/office/word/2012/wordml" xmlns:w16cei="http://schemas.microsoft.com/office/word/2026/wordml/cei" xmlns:w16cex="http://schemas.microsoft.com/office/word/2018/wordml/cex" xmlns:w16cid="http://schemas.microsoft.com/office/word/2016/wordml/cid" xmlns:w16="http://schemas.microsoft.com/office/word/2018/wordml" xmlns:w16du="http://schemas.microsoft.com/office/word/2023/wordml/word16du" xmlns:w16sdtdh="http://schemas.microsoft.com/office/word/2020/wordml/sdtdatahash" xmlns:w16sdtfl="http://schemas.microsoft.com/office/word/2024/wordml/sdtformatlock" xmlns:w16se="http://schemas.microsoft.com/office/word/2015/wordml/symex" xmlns:wpg="http://schemas.microsoft.com/office/word/2010/wordprocessingGroup" xmlns:wpi="http://schemas.microsoft.com/office/word/2010/wordprocessingInk" xmlns:wne="http://schemas.microsoft.com/office/word/2006/wordml" xmlns:wps="http://schemas.microsoft.com/office/word/2010/wordprocessingShape" mc:Ignorable="w14 w15 w16se w16cid w16 w16cex w16sdtdh w16sdtfl w16du wp14">
-  <w:footnote w:type="separator" w:id="-1">
-    <w:p>
-      <w:pPr>
-        <w:spacing w:after="0"/>
+<w:footnotes xmlns:wpc="http://schemas.microsoft.com/office/word/2010/wordprocessingCanvas" xmlns:mc="http://schemas.openxmlformats.org/markup-compatibility/2006" xmlns:o="urn:schemas-microsoft-com:office:office" xmlns:r="http://schemas.openxmlformats.org/officeDocument/2006/relationships" xmlns:m="http://schemas.openxmlformats.org/officeDocument/2006/math" xmlns:v="urn:schemas-microsoft-com:vml" xmlns:wp14="http://schemas.microsoft.com/office/word/2010/wordprocessingDrawing" xmlns:wp="http://schemas.openxmlformats.org/drawingml/2006/wordprocessingDrawing" xmlns:w="http://schemas.openxmlformats.org/wordprocessingml/2006/main" xmlns:w14="http://schemas.microsoft.com/office/word/2010/wordml" xmlns:w15="http://schemas.microsoft.com/office/word/2012/wordml" xmlns:w10="urn:schemas-microsoft-com:office:word" xmlns:wpg="http://schemas.microsoft.com/office/word/2010/wordprocessingGroup" xmlns:wpi="http://schemas.microsoft.com/office/word/2010/wordprocessingInk" xmlns:wne="http://schemas.microsoft.com/office/word/2006/wordml" xmlns:wps="http://schemas.microsoft.com/office/word/2010/wordprocessingShape" xmlns:wpsCustomData="http://www.wps.cn/officeDocument/2013/wpsCustomData" mc:Ignorable="w14 w15 wp14">
+  <w:footnote w:type="separator" w:id="0">
+    <w:p>
+      <w:pPr>
+        <w:spacing w:before="0" w:after="0" w:line="278" w:lineRule="auto"/>
       </w:pPr>
       <w:r>
         <w:separator/>
       </w:r>
     </w:p>
   </w:footnote>
-  <w:footnote w:type="continuationSeparator" w:id="0">
-    <w:p>
-      <w:pPr>
-        <w:spacing w:after="0"/>
+  <w:footnote w:type="continuationSeparator" w:id="1">
+    <w:p>
+      <w:pPr>
+        <w:spacing w:before="0" w:after="0" w:line="278" w:lineRule="auto"/>
       </w:pPr>
       <w:r>
         <w:continuationSeparator/>
@@ -1852,10 +1768,10 @@
 </file>
 
 <file path=word/header1.xml><?xml version="1.0" encoding="utf-8"?>
-<w:hdr xmlns:wpc="http://schemas.microsoft.com/office/word/2010/wordprocessingCanvas" xmlns:cx="http://schemas.microsoft.com/office/drawing/2014/chartex" xmlns:cx1="http://schemas.microsoft.com/office/drawing/2015/9/8/chartex" xmlns:cx2="http://schemas.microsoft.com/office/drawing/2015/10/21/chartex" xmlns:cx3="http://schemas.microsoft.com/office/drawing/2016/5/9/chartex" xmlns:cx4="http://schemas.microsoft.com/office/drawing/2016/5/10/chartex" xmlns:cx5="http://schemas.microsoft.com/office/drawing/2016/5/11/chartex" xmlns:cx6="http://schemas.microsoft.com/office/drawing/2016/5/12/chartex" xmlns:cx7="http://schemas.microsoft.com/office/drawing/2016/5/13/chartex" xmlns:cx8="http://schemas.microsoft.com/office/drawing/2016/5/14/chartex" xmlns:mc="http://schemas.openxmlformats.org/markup-compatibility/2006" xmlns:aink="http://schemas.microsoft.com/office/drawing/2016/ink" xmlns:am3d="http://schemas.microsoft.com/office/drawing/2017/model3d" xmlns:o="urn:schemas-microsoft-com:office:office" xmlns:oel="http://schemas.microsoft.com/office/2019/extlst" xmlns:r="http://schemas.openxmlformats.org/officeDocument/2006/relationships" xmlns:m="http://schemas.openxmlformats.org/officeDocument/2006/math" xmlns:v="urn:schemas-microsoft-com:vml" xmlns:wp14="http://schemas.microsoft.com/office/word/2010/wordprocessingDrawing" xmlns:wp="http://schemas.openxmlformats.org/drawingml/2006/wordprocessingDrawing" xmlns:w10="urn:schemas-microsoft-com:office:word" xmlns:w="http://schemas.openxmlformats.org/wordprocessingml/2006/main" xmlns:w14="http://schemas.microsoft.com/office/word/2010/wordml" xmlns:w15="http://schemas.microsoft.com/office/word/2012/wordml" xmlns:w16cei="http://schemas.microsoft.com/office/word/2026/wordml/cei" xmlns:w16cex="http://schemas.microsoft.com/office/word/2018/wordml/cex" xmlns:w16cid="http://schemas.microsoft.com/office/word/2016/wordml/cid" xmlns:w16="http://schemas.microsoft.com/office/word/2018/wordml" xmlns:w16du="http://schemas.microsoft.com/office/word/2023/wordml/word16du" xmlns:w16sdtdh="http://schemas.microsoft.com/office/word/2020/wordml/sdtdatahash" xmlns:w16sdtfl="http://schemas.microsoft.com/office/word/2024/wordml/sdtformatlock" xmlns:w16se="http://schemas.microsoft.com/office/word/2015/wordml/symex" xmlns:wpg="http://schemas.microsoft.com/office/word/2010/wordprocessingGroup" xmlns:wpi="http://schemas.microsoft.com/office/word/2010/wordprocessingInk" xmlns:wne="http://schemas.microsoft.com/office/word/2006/wordml" xmlns:wps="http://schemas.microsoft.com/office/word/2010/wordprocessingShape" mc:Ignorable="w14 w15 w16se w16cid w16 w16cex w16sdtdh w16sdtfl w16du wp14">
+<w:hdr xmlns:wpc="http://schemas.microsoft.com/office/word/2010/wordprocessingCanvas" xmlns:mc="http://schemas.openxmlformats.org/markup-compatibility/2006" xmlns:o="urn:schemas-microsoft-com:office:office" xmlns:r="http://schemas.openxmlformats.org/officeDocument/2006/relationships" xmlns:m="http://schemas.openxmlformats.org/officeDocument/2006/math" xmlns:v="urn:schemas-microsoft-com:vml" xmlns:wp14="http://schemas.microsoft.com/office/word/2010/wordprocessingDrawing" xmlns:wp="http://schemas.openxmlformats.org/drawingml/2006/wordprocessingDrawing" xmlns:w10="urn:schemas-microsoft-com:office:word" xmlns:w="http://schemas.openxmlformats.org/wordprocessingml/2006/main" xmlns:w14="http://schemas.microsoft.com/office/word/2010/wordml" xmlns:w15="http://schemas.microsoft.com/office/word/2012/wordml" xmlns:wpg="http://schemas.microsoft.com/office/word/2010/wordprocessingGroup" xmlns:wpi="http://schemas.microsoft.com/office/word/2010/wordprocessingInk" xmlns:wne="http://schemas.microsoft.com/office/word/2006/wordml" xmlns:wps="http://schemas.microsoft.com/office/word/2010/wordprocessingShape" xmlns:wpsCustomData="http://www.wps.cn/officeDocument/2013/wpsCustomData" mc:Ignorable="w14 w15 wp14">
   <w:p>
     <w:pPr>
-      <w:pStyle w:val="Header"/>
+      <w:pStyle w:val="18"/>
       <w:rPr>
         <w:rFonts w:asciiTheme="majorHAnsi" w:hAnsiTheme="majorHAnsi"/>
         <w:b/>
@@ -1889,433 +1805,298 @@
         <w:bCs/>
         <w:highlight w:val="yellow"/>
       </w:rPr>
-      <w:t>25D</w:t>
-    </w:r>
-    <w:r>
-      <w:rPr>
-        <w:rFonts w:asciiTheme="majorHAnsi" w:hAnsiTheme="majorHAnsi"/>
-        <w:b/>
-        <w:bCs/>
-        <w:highlight w:val="yellow"/>
-      </w:rPr>
-      <w:t>CE014</w:t>
+      <w:t>25DCE014</w:t>
     </w:r>
   </w:p>
 </w:hdr>
 </file>
 
 <file path=word/styles.xml><?xml version="1.0" encoding="utf-8"?>
-<w:styles xmlns:mc="http://schemas.openxmlformats.org/markup-compatibility/2006" xmlns:r="http://schemas.openxmlformats.org/officeDocument/2006/relationships" xmlns:w="http://schemas.openxmlformats.org/wordprocessingml/2006/main" xmlns:w14="http://schemas.microsoft.com/office/word/2010/wordml" xmlns:w15="http://schemas.microsoft.com/office/word/2012/wordml" xmlns:w16cex="http://schemas.microsoft.com/office/word/2018/wordml/cex" xmlns:w16cid="http://schemas.microsoft.com/office/word/2016/wordml/cid" xmlns:w16="http://schemas.microsoft.com/office/word/2018/wordml" xmlns:w16du="http://schemas.microsoft.com/office/word/2023/wordml/word16du" xmlns:w16sdtdh="http://schemas.microsoft.com/office/word/2020/wordml/sdtdatahash" xmlns:w16sdtfl="http://schemas.microsoft.com/office/word/2024/wordml/sdtformatlock" xmlns:w16se="http://schemas.microsoft.com/office/word/2015/wordml/symex" mc:Ignorable="w14 w15 w16se w16cid w16 w16cex w16sdtdh w16sdtfl w16du">
+<w:styles xmlns:mc="http://schemas.openxmlformats.org/markup-compatibility/2006" xmlns:o="urn:schemas-microsoft-com:office:office" xmlns:r="http://schemas.openxmlformats.org/officeDocument/2006/relationships" xmlns:m="http://schemas.openxmlformats.org/officeDocument/2006/math" xmlns:v="urn:schemas-microsoft-com:vml" xmlns:w="http://schemas.openxmlformats.org/wordprocessingml/2006/main" xmlns:w14="http://schemas.microsoft.com/office/word/2010/wordml" xmlns:w10="urn:schemas-microsoft-com:office:word" xmlns:sl="http://schemas.openxmlformats.org/schemaLibrary/2006/main" xmlns:wpsCustomData="http://www.wps.cn/officeDocument/2013/wpsCustomData" mc:Ignorable="w14">
   <w:docDefaults>
     <w:rPrDefault>
       <w:rPr>
-        <w:rFonts w:ascii="Times New Roman" w:eastAsia="SimSun" w:hAnsi="Times New Roman" w:cs="Times New Roman"/>
-        <w:lang w:val="en-IN" w:eastAsia="en-IN" w:bidi="ar-SA"/>
+        <w:rFonts w:ascii="Times New Roman" w:hAnsi="Times New Roman" w:eastAsia="SimSun" w:cs="Times New Roman"/>
       </w:rPr>
     </w:rPrDefault>
     <w:pPrDefault/>
   </w:docDefaults>
-  <w:latentStyles w:defLockedState="0" w:defUIPriority="99" w:defSemiHidden="0" w:defUnhideWhenUsed="0" w:defQFormat="0" w:count="376">
-    <w:lsdException w:name="Normal" w:uiPriority="0" w:qFormat="1"/>
-    <w:lsdException w:name="heading 1" w:uiPriority="9" w:qFormat="1"/>
-    <w:lsdException w:name="heading 2" w:semiHidden="1" w:uiPriority="9" w:unhideWhenUsed="1" w:qFormat="1"/>
-    <w:lsdException w:name="heading 3" w:semiHidden="1" w:uiPriority="9" w:unhideWhenUsed="1" w:qFormat="1"/>
-    <w:lsdException w:name="heading 4" w:semiHidden="1" w:uiPriority="9" w:unhideWhenUsed="1" w:qFormat="1"/>
-    <w:lsdException w:name="heading 5" w:semiHidden="1" w:uiPriority="9" w:unhideWhenUsed="1" w:qFormat="1"/>
-    <w:lsdException w:name="heading 6" w:semiHidden="1" w:uiPriority="9" w:unhideWhenUsed="1" w:qFormat="1"/>
-    <w:lsdException w:name="heading 7" w:semiHidden="1" w:uiPriority="9" w:unhideWhenUsed="1" w:qFormat="1"/>
-    <w:lsdException w:name="heading 8" w:semiHidden="1" w:uiPriority="9" w:unhideWhenUsed="1" w:qFormat="1"/>
-    <w:lsdException w:name="heading 9" w:semiHidden="1" w:uiPriority="9" w:unhideWhenUsed="1" w:qFormat="1"/>
-    <w:lsdException w:name="index 1" w:semiHidden="1" w:unhideWhenUsed="1"/>
-    <w:lsdException w:name="index 2" w:semiHidden="1" w:unhideWhenUsed="1"/>
-    <w:lsdException w:name="index 3" w:semiHidden="1" w:unhideWhenUsed="1"/>
-    <w:lsdException w:name="index 4" w:semiHidden="1" w:unhideWhenUsed="1"/>
-    <w:lsdException w:name="index 5" w:semiHidden="1" w:unhideWhenUsed="1"/>
-    <w:lsdException w:name="index 6" w:semiHidden="1" w:unhideWhenUsed="1"/>
-    <w:lsdException w:name="index 7" w:semiHidden="1" w:unhideWhenUsed="1"/>
-    <w:lsdException w:name="index 8" w:semiHidden="1" w:unhideWhenUsed="1"/>
-    <w:lsdException w:name="index 9" w:semiHidden="1" w:unhideWhenUsed="1"/>
-    <w:lsdException w:name="toc 1" w:semiHidden="1" w:uiPriority="39" w:unhideWhenUsed="1"/>
-    <w:lsdException w:name="toc 2" w:semiHidden="1" w:uiPriority="39" w:unhideWhenUsed="1"/>
-    <w:lsdException w:name="toc 3" w:semiHidden="1" w:uiPriority="39" w:unhideWhenUsed="1"/>
-    <w:lsdException w:name="toc 4" w:semiHidden="1" w:uiPriority="39" w:unhideWhenUsed="1"/>
-    <w:lsdException w:name="toc 5" w:semiHidden="1" w:uiPriority="39" w:unhideWhenUsed="1"/>
-    <w:lsdException w:name="toc 6" w:semiHidden="1" w:uiPriority="39" w:unhideWhenUsed="1"/>
-    <w:lsdException w:name="toc 7" w:semiHidden="1" w:uiPriority="39" w:unhideWhenUsed="1"/>
-    <w:lsdException w:name="toc 8" w:semiHidden="1" w:uiPriority="39" w:unhideWhenUsed="1"/>
-    <w:lsdException w:name="toc 9" w:semiHidden="1" w:uiPriority="39" w:unhideWhenUsed="1"/>
-    <w:lsdException w:name="Normal Indent" w:semiHidden="1" w:unhideWhenUsed="1"/>
-    <w:lsdException w:name="footnote text" w:semiHidden="1" w:unhideWhenUsed="1"/>
-    <w:lsdException w:name="annotation text" w:semiHidden="1" w:unhideWhenUsed="1" w:qFormat="1"/>
-    <w:lsdException w:name="header" w:unhideWhenUsed="1" w:qFormat="1"/>
-    <w:lsdException w:name="footer" w:unhideWhenUsed="1" w:qFormat="1"/>
-    <w:lsdException w:name="index heading" w:semiHidden="1" w:unhideWhenUsed="1"/>
-    <w:lsdException w:name="caption" w:semiHidden="1" w:uiPriority="35" w:unhideWhenUsed="1" w:qFormat="1"/>
-    <w:lsdException w:name="table of figures" w:semiHidden="1" w:unhideWhenUsed="1"/>
-    <w:lsdException w:name="envelope address" w:semiHidden="1" w:unhideWhenUsed="1"/>
-    <w:lsdException w:name="envelope return" w:semiHidden="1" w:unhideWhenUsed="1"/>
-    <w:lsdException w:name="footnote reference" w:semiHidden="1" w:unhideWhenUsed="1"/>
-    <w:lsdException w:name="annotation reference" w:semiHidden="1" w:unhideWhenUsed="1" w:qFormat="1"/>
-    <w:lsdException w:name="line number" w:semiHidden="1" w:unhideWhenUsed="1"/>
-    <w:lsdException w:name="page number" w:semiHidden="1" w:unhideWhenUsed="1"/>
-    <w:lsdException w:name="endnote reference" w:semiHidden="1" w:unhideWhenUsed="1"/>
-    <w:lsdException w:name="endnote text" w:semiHidden="1" w:unhideWhenUsed="1"/>
-    <w:lsdException w:name="table of authorities" w:semiHidden="1" w:unhideWhenUsed="1"/>
-    <w:lsdException w:name="macro" w:semiHidden="1" w:unhideWhenUsed="1"/>
-    <w:lsdException w:name="toa heading" w:semiHidden="1" w:unhideWhenUsed="1"/>
-    <w:lsdException w:name="List" w:semiHidden="1" w:unhideWhenUsed="1"/>
-    <w:lsdException w:name="List Bullet" w:semiHidden="1" w:unhideWhenUsed="1"/>
-    <w:lsdException w:name="List Number" w:semiHidden="1" w:unhideWhenUsed="1"/>
-    <w:lsdException w:name="List 2" w:semiHidden="1" w:unhideWhenUsed="1"/>
-    <w:lsdException w:name="List 3" w:semiHidden="1" w:unhideWhenUsed="1"/>
-    <w:lsdException w:name="List 4" w:semiHidden="1" w:unhideWhenUsed="1"/>
-    <w:lsdException w:name="List 5" w:semiHidden="1" w:unhideWhenUsed="1"/>
-    <w:lsdException w:name="List Bullet 2" w:semiHidden="1" w:unhideWhenUsed="1"/>
-    <w:lsdException w:name="List Bullet 3" w:semiHidden="1" w:unhideWhenUsed="1"/>
-    <w:lsdException w:name="List Bullet 4" w:semiHidden="1" w:unhideWhenUsed="1"/>
-    <w:lsdException w:name="List Bullet 5" w:semiHidden="1" w:unhideWhenUsed="1"/>
-    <w:lsdException w:name="List Number 2" w:semiHidden="1" w:unhideWhenUsed="1"/>
-    <w:lsdException w:name="List Number 3" w:semiHidden="1" w:unhideWhenUsed="1"/>
-    <w:lsdException w:name="List Number 4" w:semiHidden="1" w:unhideWhenUsed="1"/>
-    <w:lsdException w:name="List Number 5" w:semiHidden="1" w:unhideWhenUsed="1"/>
-    <w:lsdException w:name="Title" w:uiPriority="10" w:qFormat="1"/>
-    <w:lsdException w:name="Closing" w:semiHidden="1" w:unhideWhenUsed="1"/>
-    <w:lsdException w:name="Signature" w:semiHidden="1" w:unhideWhenUsed="1"/>
-    <w:lsdException w:name="Default Paragraph Font" w:semiHidden="1" w:uiPriority="1" w:unhideWhenUsed="1" w:qFormat="1"/>
-    <w:lsdException w:name="Body Text" w:uiPriority="1" w:qFormat="1"/>
-    <w:lsdException w:name="Body Text Indent" w:semiHidden="1" w:unhideWhenUsed="1"/>
-    <w:lsdException w:name="List Continue" w:semiHidden="1" w:unhideWhenUsed="1"/>
-    <w:lsdException w:name="List Continue 2" w:semiHidden="1" w:unhideWhenUsed="1"/>
-    <w:lsdException w:name="List Continue 3" w:semiHidden="1" w:unhideWhenUsed="1"/>
-    <w:lsdException w:name="List Continue 4" w:semiHidden="1" w:unhideWhenUsed="1"/>
-    <w:lsdException w:name="List Continue 5" w:semiHidden="1" w:unhideWhenUsed="1"/>
-    <w:lsdException w:name="Message Header" w:semiHidden="1" w:unhideWhenUsed="1"/>
-    <w:lsdException w:name="Subtitle" w:uiPriority="11" w:qFormat="1"/>
-    <w:lsdException w:name="Salutation" w:semiHidden="1" w:unhideWhenUsed="1"/>
-    <w:lsdException w:name="Date" w:semiHidden="1" w:unhideWhenUsed="1"/>
-    <w:lsdException w:name="Body Text First Indent" w:semiHidden="1" w:unhideWhenUsed="1"/>
-    <w:lsdException w:name="Body Text First Indent 2" w:semiHidden="1" w:unhideWhenUsed="1"/>
-    <w:lsdException w:name="Note Heading" w:semiHidden="1" w:unhideWhenUsed="1"/>
-    <w:lsdException w:name="Body Text 2" w:semiHidden="1" w:unhideWhenUsed="1"/>
-    <w:lsdException w:name="Body Text 3" w:semiHidden="1" w:unhideWhenUsed="1"/>
-    <w:lsdException w:name="Body Text Indent 2" w:semiHidden="1" w:unhideWhenUsed="1"/>
-    <w:lsdException w:name="Body Text Indent 3" w:semiHidden="1" w:unhideWhenUsed="1"/>
-    <w:lsdException w:name="Block Text" w:semiHidden="1" w:unhideWhenUsed="1"/>
-    <w:lsdException w:name="Hyperlink" w:unhideWhenUsed="1" w:qFormat="1"/>
-    <w:lsdException w:name="FollowedHyperlink" w:semiHidden="1" w:unhideWhenUsed="1"/>
-    <w:lsdException w:name="Strong" w:uiPriority="0" w:qFormat="1"/>
-    <w:lsdException w:name="Emphasis" w:uiPriority="20" w:qFormat="1"/>
-    <w:lsdException w:name="Document Map" w:semiHidden="1" w:unhideWhenUsed="1"/>
-    <w:lsdException w:name="Plain Text" w:semiHidden="1" w:unhideWhenUsed="1"/>
-    <w:lsdException w:name="E-mail Signature" w:semiHidden="1" w:unhideWhenUsed="1"/>
-    <w:lsdException w:name="HTML Top of Form" w:semiHidden="1" w:unhideWhenUsed="1"/>
-    <w:lsdException w:name="HTML Bottom of Form" w:semiHidden="1" w:unhideWhenUsed="1"/>
-    <w:lsdException w:name="Normal (Web)" w:semiHidden="1" w:unhideWhenUsed="1" w:qFormat="1"/>
-    <w:lsdException w:name="HTML Acronym" w:semiHidden="1" w:unhideWhenUsed="1"/>
-    <w:lsdException w:name="HTML Address" w:semiHidden="1" w:unhideWhenUsed="1"/>
-    <w:lsdException w:name="HTML Cite" w:semiHidden="1" w:unhideWhenUsed="1"/>
-    <w:lsdException w:name="HTML Code" w:semiHidden="1" w:unhideWhenUsed="1"/>
-    <w:lsdException w:name="HTML Definition" w:semiHidden="1" w:unhideWhenUsed="1"/>
-    <w:lsdException w:name="HTML Keyboard" w:semiHidden="1" w:unhideWhenUsed="1"/>
-    <w:lsdException w:name="HTML Preformatted" w:semiHidden="1" w:unhideWhenUsed="1"/>
-    <w:lsdException w:name="HTML Sample" w:semiHidden="1" w:unhideWhenUsed="1"/>
-    <w:lsdException w:name="HTML Typewriter" w:semiHidden="1" w:unhideWhenUsed="1"/>
-    <w:lsdException w:name="HTML Variable" w:semiHidden="1" w:unhideWhenUsed="1"/>
-    <w:lsdException w:name="Normal Table" w:semiHidden="1" w:unhideWhenUsed="1" w:qFormat="1"/>
-    <w:lsdException w:name="annotation subject" w:semiHidden="1" w:unhideWhenUsed="1" w:qFormat="1"/>
-    <w:lsdException w:name="No List" w:semiHidden="1" w:unhideWhenUsed="1"/>
-    <w:lsdException w:name="Outline List 1" w:semiHidden="1" w:unhideWhenUsed="1"/>
-    <w:lsdException w:name="Outline List 2" w:semiHidden="1" w:unhideWhenUsed="1"/>
-    <w:lsdException w:name="Outline List 3" w:semiHidden="1" w:unhideWhenUsed="1"/>
-    <w:lsdException w:name="Table Simple 1" w:semiHidden="1" w:unhideWhenUsed="1"/>
-    <w:lsdException w:name="Table Simple 2" w:semiHidden="1" w:unhideWhenUsed="1"/>
-    <w:lsdException w:name="Table Simple 3" w:semiHidden="1" w:unhideWhenUsed="1"/>
-    <w:lsdException w:name="Table Classic 1" w:semiHidden="1" w:unhideWhenUsed="1"/>
-    <w:lsdException w:name="Table Classic 2" w:semiHidden="1" w:unhideWhenUsed="1"/>
-    <w:lsdException w:name="Table Classic 3" w:semiHidden="1" w:unhideWhenUsed="1"/>
-    <w:lsdException w:name="Table Classic 4" w:semiHidden="1" w:unhideWhenUsed="1"/>
-    <w:lsdException w:name="Table Colorful 1" w:semiHidden="1" w:unhideWhenUsed="1"/>
-    <w:lsdException w:name="Table Colorful 2" w:semiHidden="1" w:unhideWhenUsed="1"/>
-    <w:lsdException w:name="Table Colorful 3" w:semiHidden="1" w:unhideWhenUsed="1"/>
-    <w:lsdException w:name="Table Columns 1" w:semiHidden="1" w:unhideWhenUsed="1"/>
-    <w:lsdException w:name="Table Columns 2" w:semiHidden="1" w:unhideWhenUsed="1"/>
-    <w:lsdException w:name="Table Columns 3" w:semiHidden="1" w:unhideWhenUsed="1"/>
-    <w:lsdException w:name="Table Columns 4" w:semiHidden="1" w:unhideWhenUsed="1"/>
-    <w:lsdException w:name="Table Columns 5" w:semiHidden="1" w:unhideWhenUsed="1"/>
-    <w:lsdException w:name="Table Grid 1" w:semiHidden="1" w:unhideWhenUsed="1"/>
-    <w:lsdException w:name="Table Grid 2" w:semiHidden="1" w:unhideWhenUsed="1"/>
-    <w:lsdException w:name="Table Grid 3" w:semiHidden="1" w:unhideWhenUsed="1"/>
-    <w:lsdException w:name="Table Grid 4" w:semiHidden="1" w:unhideWhenUsed="1"/>
-    <w:lsdException w:name="Table Grid 5" w:semiHidden="1" w:unhideWhenUsed="1"/>
-    <w:lsdException w:name="Table Grid 6" w:semiHidden="1" w:unhideWhenUsed="1"/>
-    <w:lsdException w:name="Table Grid 7" w:semiHidden="1" w:unhideWhenUsed="1"/>
-    <w:lsdException w:name="Table Grid 8" w:semiHidden="1" w:unhideWhenUsed="1"/>
-    <w:lsdException w:name="Table List 1" w:semiHidden="1" w:unhideWhenUsed="1"/>
-    <w:lsdException w:name="Table List 2" w:semiHidden="1" w:unhideWhenUsed="1"/>
-    <w:lsdException w:name="Table List 3" w:semiHidden="1" w:unhideWhenUsed="1"/>
-    <w:lsdException w:name="Table List 4" w:semiHidden="1" w:unhideWhenUsed="1"/>
-    <w:lsdException w:name="Table List 5" w:semiHidden="1" w:unhideWhenUsed="1"/>
-    <w:lsdException w:name="Table List 6" w:semiHidden="1" w:unhideWhenUsed="1"/>
-    <w:lsdException w:name="Table List 7" w:semiHidden="1" w:unhideWhenUsed="1"/>
-    <w:lsdException w:name="Table List 8" w:semiHidden="1" w:unhideWhenUsed="1"/>
-    <w:lsdException w:name="Table 3D effects 1" w:semiHidden="1" w:unhideWhenUsed="1"/>
-    <w:lsdException w:name="Table 3D effects 2" w:semiHidden="1" w:unhideWhenUsed="1"/>
-    <w:lsdException w:name="Table 3D effects 3" w:semiHidden="1" w:unhideWhenUsed="1"/>
-    <w:lsdException w:name="Table Contemporary" w:semiHidden="1" w:unhideWhenUsed="1"/>
-    <w:lsdException w:name="Table Elegant" w:semiHidden="1" w:unhideWhenUsed="1"/>
-    <w:lsdException w:name="Table Professional" w:semiHidden="1" w:unhideWhenUsed="1"/>
-    <w:lsdException w:name="Table Subtle 1" w:semiHidden="1" w:unhideWhenUsed="1"/>
-    <w:lsdException w:name="Table Subtle 2" w:semiHidden="1" w:unhideWhenUsed="1"/>
-    <w:lsdException w:name="Table Web 1" w:semiHidden="1" w:unhideWhenUsed="1"/>
-    <w:lsdException w:name="Table Web 2" w:semiHidden="1" w:unhideWhenUsed="1"/>
-    <w:lsdException w:name="Table Web 3" w:semiHidden="1" w:unhideWhenUsed="1"/>
-    <w:lsdException w:name="Balloon Text" w:semiHidden="1" w:unhideWhenUsed="1"/>
-    <w:lsdException w:name="Table Grid" w:uiPriority="39"/>
-    <w:lsdException w:name="Table Theme" w:semiHidden="1" w:unhideWhenUsed="1"/>
-    <w:lsdException w:name="Placeholder Text" w:semiHidden="1" w:unhideWhenUsed="1"/>
-    <w:lsdException w:name="No Spacing" w:semiHidden="1" w:unhideWhenUsed="1"/>
-    <w:lsdException w:name="Light Shading" w:uiPriority="60"/>
-    <w:lsdException w:name="Light List" w:uiPriority="61"/>
-    <w:lsdException w:name="Light Grid" w:uiPriority="62"/>
-    <w:lsdException w:name="Medium Shading 1" w:uiPriority="63"/>
-    <w:lsdException w:name="Medium Shading 2" w:uiPriority="64"/>
-    <w:lsdException w:name="Medium List 1" w:uiPriority="65"/>
-    <w:lsdException w:name="Medium List 2" w:uiPriority="66"/>
-    <w:lsdException w:name="Medium Grid 1" w:uiPriority="67"/>
-    <w:lsdException w:name="Medium Grid 2" w:uiPriority="68"/>
-    <w:lsdException w:name="Medium Grid 3" w:uiPriority="69"/>
-    <w:lsdException w:name="Dark List" w:uiPriority="70"/>
-    <w:lsdException w:name="Colorful Shading" w:uiPriority="71"/>
-    <w:lsdException w:name="Colorful List" w:uiPriority="72"/>
-    <w:lsdException w:name="Colorful Grid" w:uiPriority="73"/>
-    <w:lsdException w:name="Light Shading Accent 1" w:uiPriority="60"/>
-    <w:lsdException w:name="Light List Accent 1" w:uiPriority="61"/>
-    <w:lsdException w:name="Light Grid Accent 1" w:uiPriority="62"/>
-    <w:lsdException w:name="Medium Shading 1 Accent 1" w:uiPriority="63"/>
-    <w:lsdException w:name="Medium Shading 2 Accent 1" w:uiPriority="64"/>
-    <w:lsdException w:name="Medium List 1 Accent 1" w:uiPriority="65"/>
-    <w:lsdException w:name="Revision" w:semiHidden="1" w:unhideWhenUsed="1"/>
-    <w:lsdException w:name="List Paragraph" w:uiPriority="34" w:qFormat="1"/>
-    <w:lsdException w:name="Quote" w:uiPriority="29" w:qFormat="1"/>
-    <w:lsdException w:name="Intense Quote" w:uiPriority="30" w:qFormat="1"/>
-    <w:lsdException w:name="Medium List 2 Accent 1" w:uiPriority="66"/>
-    <w:lsdException w:name="Medium Grid 1 Accent 1" w:uiPriority="67"/>
-    <w:lsdException w:name="Medium Grid 2 Accent 1" w:uiPriority="68"/>
-    <w:lsdException w:name="Medium Grid 3 Accent 1" w:uiPriority="69"/>
-    <w:lsdException w:name="Dark List Accent 1" w:uiPriority="70"/>
-    <w:lsdException w:name="Colorful Shading Accent 1" w:uiPriority="71"/>
-    <w:lsdException w:name="Colorful List Accent 1" w:uiPriority="72"/>
-    <w:lsdException w:name="Colorful Grid Accent 1" w:uiPriority="73"/>
-    <w:lsdException w:name="Light Shading Accent 2" w:uiPriority="60"/>
-    <w:lsdException w:name="Light List Accent 2" w:uiPriority="61"/>
-    <w:lsdException w:name="Light Grid Accent 2" w:uiPriority="62"/>
-    <w:lsdException w:name="Medium Shading 1 Accent 2" w:uiPriority="63"/>
-    <w:lsdException w:name="Medium Shading 2 Accent 2" w:uiPriority="64"/>
-    <w:lsdException w:name="Medium List 1 Accent 2" w:uiPriority="65"/>
-    <w:lsdException w:name="Medium List 2 Accent 2" w:uiPriority="66"/>
-    <w:lsdException w:name="Medium Grid 1 Accent 2" w:uiPriority="67"/>
-    <w:lsdException w:name="Medium Grid 2 Accent 2" w:uiPriority="68"/>
-    <w:lsdException w:name="Medium Grid 3 Accent 2" w:uiPriority="69"/>
-    <w:lsdException w:name="Dark List Accent 2" w:uiPriority="70"/>
-    <w:lsdException w:name="Colorful Shading Accent 2" w:uiPriority="71"/>
-    <w:lsdException w:name="Colorful List Accent 2" w:uiPriority="72"/>
-    <w:lsdException w:name="Colorful Grid Accent 2" w:uiPriority="73"/>
-    <w:lsdException w:name="Light Shading Accent 3" w:uiPriority="60"/>
-    <w:lsdException w:name="Light List Accent 3" w:uiPriority="61"/>
-    <w:lsdException w:name="Light Grid Accent 3" w:uiPriority="62"/>
-    <w:lsdException w:name="Medium Shading 1 Accent 3" w:uiPriority="63"/>
-    <w:lsdException w:name="Medium Shading 2 Accent 3" w:uiPriority="64"/>
-    <w:lsdException w:name="Medium List 1 Accent 3" w:uiPriority="65"/>
-    <w:lsdException w:name="Medium List 2 Accent 3" w:uiPriority="66"/>
-    <w:lsdException w:name="Medium Grid 1 Accent 3" w:uiPriority="67"/>
-    <w:lsdException w:name="Medium Grid 2 Accent 3" w:uiPriority="68"/>
-    <w:lsdException w:name="Medium Grid 3 Accent 3" w:uiPriority="69"/>
-    <w:lsdException w:name="Dark List Accent 3" w:uiPriority="70"/>
-    <w:lsdException w:name="Colorful Shading Accent 3" w:uiPriority="71"/>
-    <w:lsdException w:name="Colorful List Accent 3" w:uiPriority="72"/>
-    <w:lsdException w:name="Colorful Grid Accent 3" w:uiPriority="73"/>
-    <w:lsdException w:name="Light Shading Accent 4" w:uiPriority="60"/>
-    <w:lsdException w:name="Light List Accent 4" w:uiPriority="61"/>
-    <w:lsdException w:name="Light Grid Accent 4" w:uiPriority="62"/>
-    <w:lsdException w:name="Medium Shading 1 Accent 4" w:uiPriority="63"/>
-    <w:lsdException w:name="Medium Shading 2 Accent 4" w:uiPriority="64"/>
-    <w:lsdException w:name="Medium List 1 Accent 4" w:uiPriority="65"/>
-    <w:lsdException w:name="Medium List 2 Accent 4" w:uiPriority="66"/>
-    <w:lsdException w:name="Medium Grid 1 Accent 4" w:uiPriority="67"/>
-    <w:lsdException w:name="Medium Grid 2 Accent 4" w:uiPriority="68"/>
-    <w:lsdException w:name="Medium Grid 3 Accent 4" w:uiPriority="69"/>
-    <w:lsdException w:name="Dark List Accent 4" w:uiPriority="70"/>
-    <w:lsdException w:name="Colorful Shading Accent 4" w:uiPriority="71"/>
-    <w:lsdException w:name="Colorful List Accent 4" w:uiPriority="72"/>
-    <w:lsdException w:name="Colorful Grid Accent 4" w:uiPriority="73"/>
-    <w:lsdException w:name="Light Shading Accent 5" w:uiPriority="60"/>
-    <w:lsdException w:name="Light List Accent 5" w:uiPriority="61"/>
-    <w:lsdException w:name="Light Grid Accent 5" w:uiPriority="62"/>
-    <w:lsdException w:name="Medium Shading 1 Accent 5" w:uiPriority="63"/>
-    <w:lsdException w:name="Medium Shading 2 Accent 5" w:uiPriority="64"/>
-    <w:lsdException w:name="Medium List 1 Accent 5" w:uiPriority="65"/>
-    <w:lsdException w:name="Medium List 2 Accent 5" w:uiPriority="66"/>
-    <w:lsdException w:name="Medium Grid 1 Accent 5" w:uiPriority="67"/>
-    <w:lsdException w:name="Medium Grid 2 Accent 5" w:uiPriority="68"/>
-    <w:lsdException w:name="Medium Grid 3 Accent 5" w:uiPriority="69"/>
-    <w:lsdException w:name="Dark List Accent 5" w:uiPriority="70"/>
-    <w:lsdException w:name="Colorful Shading Accent 5" w:uiPriority="71"/>
-    <w:lsdException w:name="Colorful List Accent 5" w:uiPriority="72"/>
-    <w:lsdException w:name="Colorful Grid Accent 5" w:uiPriority="73"/>
-    <w:lsdException w:name="Light Shading Accent 6" w:uiPriority="60"/>
-    <w:lsdException w:name="Light List Accent 6" w:uiPriority="61"/>
-    <w:lsdException w:name="Light Grid Accent 6" w:uiPriority="62"/>
-    <w:lsdException w:name="Medium Shading 1 Accent 6" w:uiPriority="63"/>
-    <w:lsdException w:name="Medium Shading 2 Accent 6" w:uiPriority="64"/>
-    <w:lsdException w:name="Medium List 1 Accent 6" w:uiPriority="65"/>
-    <w:lsdException w:name="Medium List 2 Accent 6" w:uiPriority="66"/>
-    <w:lsdException w:name="Medium Grid 1 Accent 6" w:uiPriority="67"/>
-    <w:lsdException w:name="Medium Grid 2 Accent 6" w:uiPriority="68"/>
-    <w:lsdException w:name="Medium Grid 3 Accent 6" w:uiPriority="69"/>
-    <w:lsdException w:name="Dark List Accent 6" w:uiPriority="70"/>
-    <w:lsdException w:name="Colorful Shading Accent 6" w:uiPriority="71"/>
-    <w:lsdException w:name="Colorful List Accent 6" w:uiPriority="72"/>
-    <w:lsdException w:name="Colorful Grid Accent 6" w:uiPriority="73"/>
-    <w:lsdException w:name="Subtle Emphasis" w:uiPriority="19" w:qFormat="1"/>
-    <w:lsdException w:name="Intense Emphasis" w:uiPriority="21" w:qFormat="1"/>
-    <w:lsdException w:name="Subtle Reference" w:uiPriority="31" w:qFormat="1"/>
-    <w:lsdException w:name="Intense Reference" w:uiPriority="32" w:qFormat="1"/>
-    <w:lsdException w:name="Book Title" w:uiPriority="33" w:qFormat="1"/>
-    <w:lsdException w:name="Bibliography" w:semiHidden="1" w:uiPriority="37" w:unhideWhenUsed="1"/>
-    <w:lsdException w:name="TOC Heading" w:semiHidden="1" w:uiPriority="39" w:unhideWhenUsed="1" w:qFormat="1"/>
-    <w:lsdException w:name="Plain Table 1" w:uiPriority="41"/>
-    <w:lsdException w:name="Plain Table 2" w:uiPriority="42"/>
-    <w:lsdException w:name="Plain Table 3" w:uiPriority="43"/>
-    <w:lsdException w:name="Plain Table 4" w:uiPriority="44"/>
-    <w:lsdException w:name="Plain Table 5" w:uiPriority="45"/>
-    <w:lsdException w:name="Grid Table Light" w:uiPriority="40"/>
-    <w:lsdException w:name="Grid Table 1 Light" w:uiPriority="46"/>
-    <w:lsdException w:name="Grid Table 2" w:uiPriority="47"/>
-    <w:lsdException w:name="Grid Table 3" w:uiPriority="48"/>
-    <w:lsdException w:name="Grid Table 4" w:uiPriority="49"/>
-    <w:lsdException w:name="Grid Table 5 Dark" w:uiPriority="50"/>
-    <w:lsdException w:name="Grid Table 6 Colorful" w:uiPriority="51"/>
-    <w:lsdException w:name="Grid Table 7 Colorful" w:uiPriority="52"/>
-    <w:lsdException w:name="Grid Table 1 Light Accent 1" w:uiPriority="46"/>
-    <w:lsdException w:name="Grid Table 2 Accent 1" w:uiPriority="47"/>
-    <w:lsdException w:name="Grid Table 3 Accent 1" w:uiPriority="48"/>
-    <w:lsdException w:name="Grid Table 4 Accent 1" w:uiPriority="49"/>
-    <w:lsdException w:name="Grid Table 5 Dark Accent 1" w:uiPriority="50"/>
-    <w:lsdException w:name="Grid Table 6 Colorful Accent 1" w:uiPriority="51"/>
-    <w:lsdException w:name="Grid Table 7 Colorful Accent 1" w:uiPriority="52"/>
-    <w:lsdException w:name="Grid Table 1 Light Accent 2" w:uiPriority="46"/>
-    <w:lsdException w:name="Grid Table 2 Accent 2" w:uiPriority="47"/>
-    <w:lsdException w:name="Grid Table 3 Accent 2" w:uiPriority="48"/>
-    <w:lsdException w:name="Grid Table 4 Accent 2" w:uiPriority="49"/>
-    <w:lsdException w:name="Grid Table 5 Dark Accent 2" w:uiPriority="50"/>
-    <w:lsdException w:name="Grid Table 6 Colorful Accent 2" w:uiPriority="51"/>
-    <w:lsdException w:name="Grid Table 7 Colorful Accent 2" w:uiPriority="52"/>
-    <w:lsdException w:name="Grid Table 1 Light Accent 3" w:uiPriority="46"/>
-    <w:lsdException w:name="Grid Table 2 Accent 3" w:uiPriority="47"/>
-    <w:lsdException w:name="Grid Table 3 Accent 3" w:uiPriority="48"/>
-    <w:lsdException w:name="Grid Table 4 Accent 3" w:uiPriority="49"/>
-    <w:lsdException w:name="Grid Table 5 Dark Accent 3" w:uiPriority="50"/>
-    <w:lsdException w:name="Grid Table 6 Colorful Accent 3" w:uiPriority="51"/>
-    <w:lsdException w:name="Grid Table 7 Colorful Accent 3" w:uiPriority="52"/>
-    <w:lsdException w:name="Grid Table 1 Light Accent 4" w:uiPriority="46"/>
-    <w:lsdException w:name="Grid Table 2 Accent 4" w:uiPriority="47"/>
-    <w:lsdException w:name="Grid Table 3 Accent 4" w:uiPriority="48"/>
-    <w:lsdException w:name="Grid Table 4 Accent 4" w:uiPriority="49"/>
-    <w:lsdException w:name="Grid Table 5 Dark Accent 4" w:uiPriority="50"/>
-    <w:lsdException w:name="Grid Table 6 Colorful Accent 4" w:uiPriority="51"/>
-    <w:lsdException w:name="Grid Table 7 Colorful Accent 4" w:uiPriority="52"/>
-    <w:lsdException w:name="Grid Table 1 Light Accent 5" w:uiPriority="46"/>
-    <w:lsdException w:name="Grid Table 2 Accent 5" w:uiPriority="47"/>
-    <w:lsdException w:name="Grid Table 3 Accent 5" w:uiPriority="48"/>
-    <w:lsdException w:name="Grid Table 4 Accent 5" w:uiPriority="49"/>
-    <w:lsdException w:name="Grid Table 5 Dark Accent 5" w:uiPriority="50"/>
-    <w:lsdException w:name="Grid Table 6 Colorful Accent 5" w:uiPriority="51"/>
-    <w:lsdException w:name="Grid Table 7 Colorful Accent 5" w:uiPriority="52"/>
-    <w:lsdException w:name="Grid Table 1 Light Accent 6" w:uiPriority="46"/>
-    <w:lsdException w:name="Grid Table 2 Accent 6" w:uiPriority="47"/>
-    <w:lsdException w:name="Grid Table 3 Accent 6" w:uiPriority="48"/>
-    <w:lsdException w:name="Grid Table 4 Accent 6" w:uiPriority="49"/>
-    <w:lsdException w:name="Grid Table 5 Dark Accent 6" w:uiPriority="50"/>
-    <w:lsdException w:name="Grid Table 6 Colorful Accent 6" w:uiPriority="51"/>
-    <w:lsdException w:name="Grid Table 7 Colorful Accent 6" w:uiPriority="52"/>
-    <w:lsdException w:name="List Table 1 Light" w:uiPriority="46"/>
-    <w:lsdException w:name="List Table 2" w:uiPriority="47"/>
-    <w:lsdException w:name="List Table 3" w:uiPriority="48"/>
-    <w:lsdException w:name="List Table 4" w:uiPriority="49"/>
-    <w:lsdException w:name="List Table 5 Dark" w:uiPriority="50"/>
-    <w:lsdException w:name="List Table 6 Colorful" w:uiPriority="51"/>
-    <w:lsdException w:name="List Table 7 Colorful" w:uiPriority="52"/>
-    <w:lsdException w:name="List Table 1 Light Accent 1" w:uiPriority="46"/>
-    <w:lsdException w:name="List Table 2 Accent 1" w:uiPriority="47"/>
-    <w:lsdException w:name="List Table 3 Accent 1" w:uiPriority="48"/>
-    <w:lsdException w:name="List Table 4 Accent 1" w:uiPriority="49"/>
-    <w:lsdException w:name="List Table 5 Dark Accent 1" w:uiPriority="50"/>
-    <w:lsdException w:name="List Table 6 Colorful Accent 1" w:uiPriority="51"/>
-    <w:lsdException w:name="List Table 7 Colorful Accent 1" w:uiPriority="52"/>
-    <w:lsdException w:name="List Table 1 Light Accent 2" w:uiPriority="46"/>
-    <w:lsdException w:name="List Table 2 Accent 2" w:uiPriority="47"/>
-    <w:lsdException w:name="List Table 3 Accent 2" w:uiPriority="48"/>
-    <w:lsdException w:name="List Table 4 Accent 2" w:uiPriority="49"/>
-    <w:lsdException w:name="List Table 5 Dark Accent 2" w:uiPriority="50"/>
-    <w:lsdException w:name="List Table 6 Colorful Accent 2" w:uiPriority="51"/>
-    <w:lsdException w:name="List Table 7 Colorful Accent 2" w:uiPriority="52"/>
-    <w:lsdException w:name="List Table 1 Light Accent 3" w:uiPriority="46"/>
-    <w:lsdException w:name="List Table 2 Accent 3" w:uiPriority="47"/>
-    <w:lsdException w:name="List Table 3 Accent 3" w:uiPriority="48"/>
-    <w:lsdException w:name="List Table 4 Accent 3" w:uiPriority="49"/>
-    <w:lsdException w:name="List Table 5 Dark Accent 3" w:uiPriority="50"/>
-    <w:lsdException w:name="List Table 6 Colorful Accent 3" w:uiPriority="51"/>
-    <w:lsdException w:name="List Table 7 Colorful Accent 3" w:uiPriority="52"/>
-    <w:lsdException w:name="List Table 1 Light Accent 4" w:uiPriority="46"/>
-    <w:lsdException w:name="List Table 2 Accent 4" w:uiPriority="47"/>
-    <w:lsdException w:name="List Table 3 Accent 4" w:uiPriority="48"/>
-    <w:lsdException w:name="List Table 4 Accent 4" w:uiPriority="49"/>
-    <w:lsdException w:name="List Table 5 Dark Accent 4" w:uiPriority="50"/>
-    <w:lsdException w:name="List Table 6 Colorful Accent 4" w:uiPriority="51"/>
-    <w:lsdException w:name="List Table 7 Colorful Accent 4" w:uiPriority="52"/>
-    <w:lsdException w:name="List Table 1 Light Accent 5" w:uiPriority="46"/>
-    <w:lsdException w:name="List Table 2 Accent 5" w:uiPriority="47"/>
-    <w:lsdException w:name="List Table 3 Accent 5" w:uiPriority="48"/>
-    <w:lsdException w:name="List Table 4 Accent 5" w:uiPriority="49"/>
-    <w:lsdException w:name="List Table 5 Dark Accent 5" w:uiPriority="50"/>
-    <w:lsdException w:name="List Table 6 Colorful Accent 5" w:uiPriority="51"/>
-    <w:lsdException w:name="List Table 7 Colorful Accent 5" w:uiPriority="52"/>
-    <w:lsdException w:name="List Table 1 Light Accent 6" w:uiPriority="46"/>
-    <w:lsdException w:name="List Table 2 Accent 6" w:uiPriority="47"/>
-    <w:lsdException w:name="List Table 3 Accent 6" w:uiPriority="48"/>
-    <w:lsdException w:name="List Table 4 Accent 6" w:uiPriority="49"/>
-    <w:lsdException w:name="List Table 5 Dark Accent 6" w:uiPriority="50"/>
-    <w:lsdException w:name="List Table 6 Colorful Accent 6" w:uiPriority="51"/>
-    <w:lsdException w:name="List Table 7 Colorful Accent 6" w:uiPriority="52"/>
-    <w:lsdException w:name="Mention" w:semiHidden="1" w:unhideWhenUsed="1"/>
-    <w:lsdException w:name="Smart Hyperlink" w:semiHidden="1" w:unhideWhenUsed="1"/>
-    <w:lsdException w:name="Hashtag" w:semiHidden="1" w:unhideWhenUsed="1"/>
-    <w:lsdException w:name="Unresolved Mention" w:semiHidden="1" w:unhideWhenUsed="1"/>
-    <w:lsdException w:name="Smart Link" w:semiHidden="1" w:unhideWhenUsed="1"/>
+  <w:latentStyles w:count="260" w:defQFormat="0" w:defUnhideWhenUsed="1" w:defSemiHidden="1" w:defUIPriority="99" w:defLockedState="0">
+    <w:lsdException w:qFormat="1" w:unhideWhenUsed="0" w:uiPriority="0" w:semiHidden="0" w:name="Normal"/>
+    <w:lsdException w:qFormat="1" w:unhideWhenUsed="0" w:uiPriority="9" w:semiHidden="0" w:name="heading 1"/>
+    <w:lsdException w:qFormat="1" w:uiPriority="9" w:name="heading 2"/>
+    <w:lsdException w:qFormat="1" w:uiPriority="9" w:name="heading 3"/>
+    <w:lsdException w:qFormat="1" w:uiPriority="9" w:name="heading 4"/>
+    <w:lsdException w:qFormat="1" w:uiPriority="9" w:name="heading 5"/>
+    <w:lsdException w:qFormat="1" w:uiPriority="9" w:name="heading 6"/>
+    <w:lsdException w:qFormat="1" w:uiPriority="9" w:name="heading 7"/>
+    <w:lsdException w:qFormat="1" w:uiPriority="9" w:name="heading 8"/>
+    <w:lsdException w:qFormat="1" w:uiPriority="9" w:name="heading 9"/>
+    <w:lsdException w:uiPriority="99" w:name="index 1"/>
+    <w:lsdException w:uiPriority="99" w:name="index 2"/>
+    <w:lsdException w:uiPriority="99" w:name="index 3"/>
+    <w:lsdException w:uiPriority="99" w:name="index 4"/>
+    <w:lsdException w:uiPriority="99" w:name="index 5"/>
+    <w:lsdException w:uiPriority="99" w:name="index 6"/>
+    <w:lsdException w:uiPriority="99" w:name="index 7"/>
+    <w:lsdException w:uiPriority="99" w:name="index 8"/>
+    <w:lsdException w:uiPriority="99" w:name="index 9"/>
+    <w:lsdException w:uiPriority="39" w:name="toc 1"/>
+    <w:lsdException w:uiPriority="39" w:name="toc 2"/>
+    <w:lsdException w:uiPriority="39" w:name="toc 3"/>
+    <w:lsdException w:uiPriority="39" w:name="toc 4"/>
+    <w:lsdException w:uiPriority="39" w:name="toc 5"/>
+    <w:lsdException w:uiPriority="39" w:name="toc 6"/>
+    <w:lsdException w:uiPriority="39" w:name="toc 7"/>
+    <w:lsdException w:uiPriority="39" w:name="toc 8"/>
+    <w:lsdException w:uiPriority="39" w:name="toc 9"/>
+    <w:lsdException w:uiPriority="99" w:name="Normal Indent"/>
+    <w:lsdException w:uiPriority="99" w:name="footnote text"/>
+    <w:lsdException w:qFormat="1" w:uiPriority="99" w:name="annotation text"/>
+    <w:lsdException w:qFormat="1" w:uiPriority="99" w:semiHidden="0" w:name="header"/>
+    <w:lsdException w:qFormat="1" w:uiPriority="99" w:semiHidden="0" w:name="footer"/>
+    <w:lsdException w:uiPriority="99" w:name="index heading"/>
+    <w:lsdException w:qFormat="1" w:uiPriority="35" w:name="caption"/>
+    <w:lsdException w:uiPriority="99" w:name="table of figures"/>
+    <w:lsdException w:uiPriority="99" w:name="envelope address"/>
+    <w:lsdException w:uiPriority="99" w:name="envelope return"/>
+    <w:lsdException w:uiPriority="99" w:name="footnote reference"/>
+    <w:lsdException w:qFormat="1" w:uiPriority="99" w:name="annotation reference"/>
+    <w:lsdException w:uiPriority="99" w:name="line number"/>
+    <w:lsdException w:uiPriority="99" w:name="page number"/>
+    <w:lsdException w:uiPriority="99" w:name="endnote reference"/>
+    <w:lsdException w:uiPriority="99" w:name="endnote text"/>
+    <w:lsdException w:uiPriority="99" w:name="table of authorities"/>
+    <w:lsdException w:uiPriority="99" w:name="macro"/>
+    <w:lsdException w:uiPriority="99" w:name="toa heading"/>
+    <w:lsdException w:uiPriority="99" w:name="List"/>
+    <w:lsdException w:uiPriority="99" w:name="List Bullet"/>
+    <w:lsdException w:uiPriority="99" w:name="List Number"/>
+    <w:lsdException w:uiPriority="99" w:name="List 2"/>
+    <w:lsdException w:uiPriority="99" w:name="List 3"/>
+    <w:lsdException w:uiPriority="99" w:name="List 4"/>
+    <w:lsdException w:uiPriority="99" w:name="List 5"/>
+    <w:lsdException w:uiPriority="99" w:name="List Bullet 2"/>
+    <w:lsdException w:uiPriority="99" w:name="List Bullet 3"/>
+    <w:lsdException w:uiPriority="99" w:name="List Bullet 4"/>
+    <w:lsdException w:uiPriority="99" w:name="List Bullet 5"/>
+    <w:lsdException w:uiPriority="99" w:name="List Number 2"/>
+    <w:lsdException w:uiPriority="99" w:name="List Number 3"/>
+    <w:lsdException w:uiPriority="99" w:name="List Number 4"/>
+    <w:lsdException w:uiPriority="99" w:name="List Number 5"/>
+    <w:lsdException w:qFormat="1" w:unhideWhenUsed="0" w:uiPriority="10" w:semiHidden="0" w:name="Title"/>
+    <w:lsdException w:uiPriority="99" w:name="Closing"/>
+    <w:lsdException w:uiPriority="99" w:name="Signature"/>
+    <w:lsdException w:qFormat="1" w:uiPriority="1" w:name="Default Paragraph Font"/>
+    <w:lsdException w:qFormat="1" w:unhideWhenUsed="0" w:uiPriority="1" w:semiHidden="0" w:name="Body Text"/>
+    <w:lsdException w:uiPriority="99" w:name="Body Text Indent"/>
+    <w:lsdException w:uiPriority="99" w:name="List Continue"/>
+    <w:lsdException w:uiPriority="99" w:name="List Continue 2"/>
+    <w:lsdException w:uiPriority="99" w:name="List Continue 3"/>
+    <w:lsdException w:uiPriority="99" w:name="List Continue 4"/>
+    <w:lsdException w:uiPriority="99" w:name="List Continue 5"/>
+    <w:lsdException w:uiPriority="99" w:name="Message Header"/>
+    <w:lsdException w:qFormat="1" w:unhideWhenUsed="0" w:uiPriority="11" w:semiHidden="0" w:name="Subtitle"/>
+    <w:lsdException w:uiPriority="99" w:name="Salutation"/>
+    <w:lsdException w:uiPriority="99" w:name="Date"/>
+    <w:lsdException w:uiPriority="99" w:name="Body Text First Indent"/>
+    <w:lsdException w:uiPriority="99" w:name="Body Text First Indent 2"/>
+    <w:lsdException w:uiPriority="99" w:name="Note Heading"/>
+    <w:lsdException w:uiPriority="99" w:name="Body Text 2"/>
+    <w:lsdException w:uiPriority="99" w:name="Body Text 3"/>
+    <w:lsdException w:uiPriority="99" w:name="Body Text Indent 2"/>
+    <w:lsdException w:uiPriority="99" w:name="Body Text Indent 3"/>
+    <w:lsdException w:uiPriority="99" w:name="Block Text"/>
+    <w:lsdException w:qFormat="1" w:uiPriority="99" w:semiHidden="0" w:name="Hyperlink"/>
+    <w:lsdException w:uiPriority="99" w:name="FollowedHyperlink"/>
+    <w:lsdException w:qFormat="1" w:unhideWhenUsed="0" w:uiPriority="0" w:semiHidden="0" w:name="Strong"/>
+    <w:lsdException w:qFormat="1" w:unhideWhenUsed="0" w:uiPriority="20" w:semiHidden="0" w:name="Emphasis"/>
+    <w:lsdException w:uiPriority="99" w:name="Document Map"/>
+    <w:lsdException w:uiPriority="99" w:name="Plain Text"/>
+    <w:lsdException w:uiPriority="99" w:name="E-mail Signature"/>
+    <w:lsdException w:qFormat="1" w:uiPriority="99" w:name="Normal (Web)"/>
+    <w:lsdException w:uiPriority="99" w:name="HTML Acronym"/>
+    <w:lsdException w:uiPriority="99" w:name="HTML Address"/>
+    <w:lsdException w:uiPriority="99" w:name="HTML Cite"/>
+    <w:lsdException w:uiPriority="99" w:name="HTML Code"/>
+    <w:lsdException w:uiPriority="99" w:name="HTML Definition"/>
+    <w:lsdException w:uiPriority="99" w:name="HTML Keyboard"/>
+    <w:lsdException w:uiPriority="99" w:name="HTML Preformatted"/>
+    <w:lsdException w:uiPriority="99" w:name="HTML Sample"/>
+    <w:lsdException w:uiPriority="99" w:name="HTML Typewriter"/>
+    <w:lsdException w:uiPriority="99" w:name="HTML Variable"/>
+    <w:lsdException w:qFormat="1" w:uiPriority="99" w:name="Normal Table"/>
+    <w:lsdException w:qFormat="1" w:uiPriority="99" w:name="annotation subject"/>
+    <w:lsdException w:uiPriority="99" w:name="Table Simple 1"/>
+    <w:lsdException w:uiPriority="99" w:name="Table Simple 2"/>
+    <w:lsdException w:uiPriority="99" w:name="Table Simple 3"/>
+    <w:lsdException w:uiPriority="99" w:name="Table Classic 1"/>
+    <w:lsdException w:uiPriority="99" w:name="Table Classic 2"/>
+    <w:lsdException w:uiPriority="99" w:name="Table Classic 3"/>
+    <w:lsdException w:uiPriority="99" w:name="Table Classic 4"/>
+    <w:lsdException w:uiPriority="99" w:name="Table Colorful 1"/>
+    <w:lsdException w:uiPriority="99" w:name="Table Colorful 2"/>
+    <w:lsdException w:uiPriority="99" w:name="Table Colorful 3"/>
+    <w:lsdException w:uiPriority="99" w:name="Table Columns 1"/>
+    <w:lsdException w:uiPriority="99" w:name="Table Columns 2"/>
+    <w:lsdException w:uiPriority="99" w:name="Table Columns 3"/>
+    <w:lsdException w:uiPriority="99" w:name="Table Columns 4"/>
+    <w:lsdException w:uiPriority="99" w:name="Table Columns 5"/>
+    <w:lsdException w:uiPriority="99" w:name="Table Grid 1"/>
+    <w:lsdException w:uiPriority="99" w:name="Table Grid 2"/>
+    <w:lsdException w:uiPriority="99" w:name="Table Grid 3"/>
+    <w:lsdException w:uiPriority="99" w:name="Table Grid 4"/>
+    <w:lsdException w:uiPriority="99" w:name="Table Grid 5"/>
+    <w:lsdException w:uiPriority="99" w:name="Table Grid 6"/>
+    <w:lsdException w:uiPriority="99" w:name="Table Grid 7"/>
+    <w:lsdException w:uiPriority="99" w:name="Table Grid 8"/>
+    <w:lsdException w:uiPriority="99" w:name="Table List 1"/>
+    <w:lsdException w:uiPriority="99" w:name="Table List 2"/>
+    <w:lsdException w:uiPriority="99" w:name="Table List 3"/>
+    <w:lsdException w:uiPriority="99" w:name="Table List 4"/>
+    <w:lsdException w:uiPriority="99" w:name="Table List 5"/>
+    <w:lsdException w:uiPriority="99" w:name="Table List 6"/>
+    <w:lsdException w:uiPriority="99" w:name="Table List 7"/>
+    <w:lsdException w:uiPriority="99" w:name="Table List 8"/>
+    <w:lsdException w:uiPriority="99" w:name="Table 3D effects 1"/>
+    <w:lsdException w:uiPriority="99" w:name="Table 3D effects 2"/>
+    <w:lsdException w:uiPriority="99" w:name="Table 3D effects 3"/>
+    <w:lsdException w:uiPriority="99" w:name="Table Contemporary"/>
+    <w:lsdException w:uiPriority="99" w:name="Table Elegant"/>
+    <w:lsdException w:uiPriority="99" w:name="Table Professional"/>
+    <w:lsdException w:uiPriority="99" w:name="Table Subtle 1"/>
+    <w:lsdException w:uiPriority="99" w:name="Table Subtle 2"/>
+    <w:lsdException w:uiPriority="99" w:name="Table Web 1"/>
+    <w:lsdException w:uiPriority="99" w:name="Table Web 2"/>
+    <w:lsdException w:uiPriority="99" w:name="Table Web 3"/>
+    <w:lsdException w:uiPriority="99" w:name="Balloon Text"/>
+    <w:lsdException w:unhideWhenUsed="0" w:uiPriority="39" w:semiHidden="0" w:name="Table Grid"/>
+    <w:lsdException w:uiPriority="99" w:name="Table Theme"/>
+    <w:lsdException w:unhideWhenUsed="0" w:uiPriority="60" w:semiHidden="0" w:name="Light Shading"/>
+    <w:lsdException w:unhideWhenUsed="0" w:uiPriority="61" w:semiHidden="0" w:name="Light List"/>
+    <w:lsdException w:unhideWhenUsed="0" w:uiPriority="62" w:semiHidden="0" w:name="Light Grid"/>
+    <w:lsdException w:unhideWhenUsed="0" w:uiPriority="63" w:semiHidden="0" w:name="Medium Shading 1"/>
+    <w:lsdException w:unhideWhenUsed="0" w:uiPriority="64" w:semiHidden="0" w:name="Medium Shading 2"/>
+    <w:lsdException w:unhideWhenUsed="0" w:uiPriority="65" w:semiHidden="0" w:name="Medium List 1"/>
+    <w:lsdException w:unhideWhenUsed="0" w:uiPriority="66" w:semiHidden="0" w:name="Medium List 2"/>
+    <w:lsdException w:unhideWhenUsed="0" w:uiPriority="67" w:semiHidden="0" w:name="Medium Grid 1"/>
+    <w:lsdException w:unhideWhenUsed="0" w:uiPriority="68" w:semiHidden="0" w:name="Medium Grid 2"/>
+    <w:lsdException w:unhideWhenUsed="0" w:uiPriority="69" w:semiHidden="0" w:name="Medium Grid 3"/>
+    <w:lsdException w:unhideWhenUsed="0" w:uiPriority="70" w:semiHidden="0" w:name="Dark List"/>
+    <w:lsdException w:unhideWhenUsed="0" w:uiPriority="71" w:semiHidden="0" w:name="Colorful Shading"/>
+    <w:lsdException w:unhideWhenUsed="0" w:uiPriority="72" w:semiHidden="0" w:name="Colorful List"/>
+    <w:lsdException w:unhideWhenUsed="0" w:uiPriority="73" w:semiHidden="0" w:name="Colorful Grid"/>
+    <w:lsdException w:unhideWhenUsed="0" w:uiPriority="60" w:semiHidden="0" w:name="Light Shading Accent 1"/>
+    <w:lsdException w:unhideWhenUsed="0" w:uiPriority="61" w:semiHidden="0" w:name="Light List Accent 1"/>
+    <w:lsdException w:unhideWhenUsed="0" w:uiPriority="62" w:semiHidden="0" w:name="Light Grid Accent 1"/>
+    <w:lsdException w:unhideWhenUsed="0" w:uiPriority="63" w:semiHidden="0" w:name="Medium Shading 1 Accent 1"/>
+    <w:lsdException w:unhideWhenUsed="0" w:uiPriority="64" w:semiHidden="0" w:name="Medium Shading 2 Accent 1"/>
+    <w:lsdException w:unhideWhenUsed="0" w:uiPriority="65" w:semiHidden="0" w:name="Medium List 1 Accent 1"/>
+    <w:lsdException w:qFormat="1" w:unhideWhenUsed="0" w:uiPriority="34" w:semiHidden="0" w:name="List Paragraph"/>
+    <w:lsdException w:qFormat="1" w:unhideWhenUsed="0" w:uiPriority="29" w:semiHidden="0" w:name="Quote"/>
+    <w:lsdException w:qFormat="1" w:unhideWhenUsed="0" w:uiPriority="30" w:semiHidden="0" w:name="Intense Quote"/>
+    <w:lsdException w:unhideWhenUsed="0" w:uiPriority="66" w:semiHidden="0" w:name="Medium List 2 Accent 1"/>
+    <w:lsdException w:unhideWhenUsed="0" w:uiPriority="67" w:semiHidden="0" w:name="Medium Grid 1 Accent 1"/>
+    <w:lsdException w:unhideWhenUsed="0" w:uiPriority="68" w:semiHidden="0" w:name="Medium Grid 2 Accent 1"/>
+    <w:lsdException w:unhideWhenUsed="0" w:uiPriority="69" w:semiHidden="0" w:name="Medium Grid 3 Accent 1"/>
+    <w:lsdException w:unhideWhenUsed="0" w:uiPriority="70" w:semiHidden="0" w:name="Dark List Accent 1"/>
+    <w:lsdException w:unhideWhenUsed="0" w:uiPriority="71" w:semiHidden="0" w:name="Colorful Shading Accent 1"/>
+    <w:lsdException w:unhideWhenUsed="0" w:uiPriority="72" w:semiHidden="0" w:name="Colorful List Accent 1"/>
+    <w:lsdException w:unhideWhenUsed="0" w:uiPriority="73" w:semiHidden="0" w:name="Colorful Grid Accent 1"/>
+    <w:lsdException w:unhideWhenUsed="0" w:uiPriority="60" w:semiHidden="0" w:name="Light Shading Accent 2"/>
+    <w:lsdException w:unhideWhenUsed="0" w:uiPriority="61" w:semiHidden="0" w:name="Light List Accent 2"/>
+    <w:lsdException w:unhideWhenUsed="0" w:uiPriority="62" w:semiHidden="0" w:name="Light Grid Accent 2"/>
+    <w:lsdException w:unhideWhenUsed="0" w:uiPriority="63" w:semiHidden="0" w:name="Medium Shading 1 Accent 2"/>
+    <w:lsdException w:unhideWhenUsed="0" w:uiPriority="64" w:semiHidden="0" w:name="Medium Shading 2 Accent 2"/>
+    <w:lsdException w:unhideWhenUsed="0" w:uiPriority="65" w:semiHidden="0" w:name="Medium List 1 Accent 2"/>
+    <w:lsdException w:unhideWhenUsed="0" w:uiPriority="66" w:semiHidden="0" w:name="Medium List 2 Accent 2"/>
+    <w:lsdException w:unhideWhenUsed="0" w:uiPriority="67" w:semiHidden="0" w:name="Medium Grid 1 Accent 2"/>
+    <w:lsdException w:unhideWhenUsed="0" w:uiPriority="68" w:semiHidden="0" w:name="Medium Grid 2 Accent 2"/>
+    <w:lsdException w:unhideWhenUsed="0" w:uiPriority="69" w:semiHidden="0" w:name="Medium Grid 3 Accent 2"/>
+    <w:lsdException w:unhideWhenUsed="0" w:uiPriority="70" w:semiHidden="0" w:name="Dark List Accent 2"/>
+    <w:lsdException w:unhideWhenUsed="0" w:uiPriority="71" w:semiHidden="0" w:name="Colorful Shading Accent 2"/>
+    <w:lsdException w:unhideWhenUsed="0" w:uiPriority="72" w:semiHidden="0" w:name="Colorful List Accent 2"/>
+    <w:lsdException w:unhideWhenUsed="0" w:uiPriority="73" w:semiHidden="0" w:name="Colorful Grid Accent 2"/>
+    <w:lsdException w:unhideWhenUsed="0" w:uiPriority="60" w:semiHidden="0" w:name="Light Shading Accent 3"/>
+    <w:lsdException w:unhideWhenUsed="0" w:uiPriority="61" w:semiHidden="0" w:name="Light List Accent 3"/>
+    <w:lsdException w:unhideWhenUsed="0" w:uiPriority="62" w:semiHidden="0" w:name="Light Grid Accent 3"/>
+    <w:lsdException w:unhideWhenUsed="0" w:uiPriority="63" w:semiHidden="0" w:name="Medium Shading 1 Accent 3"/>
+    <w:lsdException w:unhideWhenUsed="0" w:uiPriority="64" w:semiHidden="0" w:name="Medium Shading 2 Accent 3"/>
+    <w:lsdException w:unhideWhenUsed="0" w:uiPriority="65" w:semiHidden="0" w:name="Medium List 1 Accent 3"/>
+    <w:lsdException w:unhideWhenUsed="0" w:uiPriority="66" w:semiHidden="0" w:name="Medium List 2 Accent 3"/>
+    <w:lsdException w:unhideWhenUsed="0" w:uiPriority="67" w:semiHidden="0" w:name="Medium Grid 1 Accent 3"/>
+    <w:lsdException w:unhideWhenUsed="0" w:uiPriority="68" w:semiHidden="0" w:name="Medium Grid 2 Accent 3"/>
+    <w:lsdException w:unhideWhenUsed="0" w:uiPriority="69" w:semiHidden="0" w:name="Medium Grid 3 Accent 3"/>
+    <w:lsdException w:unhideWhenUsed="0" w:uiPriority="70" w:semiHidden="0" w:name="Dark List Accent 3"/>
+    <w:lsdException w:unhideWhenUsed="0" w:uiPriority="71" w:semiHidden="0" w:name="Colorful Shading Accent 3"/>
+    <w:lsdException w:unhideWhenUsed="0" w:uiPriority="72" w:semiHidden="0" w:name="Colorful List Accent 3"/>
+    <w:lsdException w:unhideWhenUsed="0" w:uiPriority="73" w:semiHidden="0" w:name="Colorful Grid Accent 3"/>
+    <w:lsdException w:unhideWhenUsed="0" w:uiPriority="60" w:semiHidden="0" w:name="Light Shading Accent 4"/>
+    <w:lsdException w:unhideWhenUsed="0" w:uiPriority="61" w:semiHidden="0" w:name="Light List Accent 4"/>
+    <w:lsdException w:unhideWhenUsed="0" w:uiPriority="62" w:semiHidden="0" w:name="Light Grid Accent 4"/>
+    <w:lsdException w:unhideWhenUsed="0" w:uiPriority="63" w:semiHidden="0" w:name="Medium Shading 1 Accent 4"/>
+    <w:lsdException w:unhideWhenUsed="0" w:uiPriority="64" w:semiHidden="0" w:name="Medium Shading 2 Accent 4"/>
+    <w:lsdException w:unhideWhenUsed="0" w:uiPriority="65" w:semiHidden="0" w:name="Medium List 1 Accent 4"/>
+    <w:lsdException w:unhideWhenUsed="0" w:uiPriority="66" w:semiHidden="0" w:name="Medium List 2 Accent 4"/>
+    <w:lsdException w:unhideWhenUsed="0" w:uiPriority="67" w:semiHidden="0" w:name="Medium Grid 1 Accent 4"/>
+    <w:lsdException w:unhideWhenUsed="0" w:uiPriority="68" w:semiHidden="0" w:name="Medium Grid 2 Accent 4"/>
+    <w:lsdException w:unhideWhenUsed="0" w:uiPriority="69" w:semiHidden="0" w:name="Medium Grid 3 Accent 4"/>
+    <w:lsdException w:unhideWhenUsed="0" w:uiPriority="70" w:semiHidden="0" w:name="Dark List Accent 4"/>
+    <w:lsdException w:unhideWhenUsed="0" w:uiPriority="71" w:semiHidden="0" w:name="Colorful Shading Accent 4"/>
+    <w:lsdException w:unhideWhenUsed="0" w:uiPriority="72" w:semiHidden="0" w:name="Colorful List Accent 4"/>
+    <w:lsdException w:unhideWhenUsed="0" w:uiPriority="73" w:semiHidden="0" w:name="Colorful Grid Accent 4"/>
+    <w:lsdException w:unhideWhenUsed="0" w:uiPriority="60" w:semiHidden="0" w:name="Light Shading Accent 5"/>
+    <w:lsdException w:unhideWhenUsed="0" w:uiPriority="61" w:semiHidden="0" w:name="Light List Accent 5"/>
+    <w:lsdException w:unhideWhenUsed="0" w:uiPriority="62" w:semiHidden="0" w:name="Light Grid Accent 5"/>
+    <w:lsdException w:unhideWhenUsed="0" w:uiPriority="63" w:semiHidden="0" w:name="Medium Shading 1 Accent 5"/>
+    <w:lsdException w:unhideWhenUsed="0" w:uiPriority="64" w:semiHidden="0" w:name="Medium Shading 2 Accent 5"/>
+    <w:lsdException w:unhideWhenUsed="0" w:uiPriority="65" w:semiHidden="0" w:name="Medium List 1 Accent 5"/>
+    <w:lsdException w:unhideWhenUsed="0" w:uiPriority="66" w:semiHidden="0" w:name="Medium List 2 Accent 5"/>
+    <w:lsdException w:unhideWhenUsed="0" w:uiPriority="67" w:semiHidden="0" w:name="Medium Grid 1 Accent 5"/>
+    <w:lsdException w:unhideWhenUsed="0" w:uiPriority="68" w:semiHidden="0" w:name="Medium Grid 2 Accent 5"/>
+    <w:lsdException w:unhideWhenUsed="0" w:uiPriority="69" w:semiHidden="0" w:name="Medium Grid 3 Accent 5"/>
+    <w:lsdException w:unhideWhenUsed="0" w:uiPriority="70" w:semiHidden="0" w:name="Dark List Accent 5"/>
+    <w:lsdException w:unhideWhenUsed="0" w:uiPriority="71" w:semiHidden="0" w:name="Colorful Shading Accent 5"/>
+    <w:lsdException w:unhideWhenUsed="0" w:uiPriority="72" w:semiHidden="0" w:name="Colorful List Accent 5"/>
+    <w:lsdException w:unhideWhenUsed="0" w:uiPriority="73" w:semiHidden="0" w:name="Colorful Grid Accent 5"/>
+    <w:lsdException w:unhideWhenUsed="0" w:uiPriority="60" w:semiHidden="0" w:name="Light Shading Accent 6"/>
+    <w:lsdException w:unhideWhenUsed="0" w:uiPriority="61" w:semiHidden="0" w:name="Light List Accent 6"/>
+    <w:lsdException w:unhideWhenUsed="0" w:uiPriority="62" w:semiHidden="0" w:name="Light Grid Accent 6"/>
+    <w:lsdException w:unhideWhenUsed="0" w:uiPriority="63" w:semiHidden="0" w:name="Medium Shading 1 Accent 6"/>
+    <w:lsdException w:unhideWhenUsed="0" w:uiPriority="64" w:semiHidden="0" w:name="Medium Shading 2 Accent 6"/>
+    <w:lsdException w:unhideWhenUsed="0" w:uiPriority="65" w:semiHidden="0" w:name="Medium List 1 Accent 6"/>
+    <w:lsdException w:unhideWhenUsed="0" w:uiPriority="66" w:semiHidden="0" w:name="Medium List 2 Accent 6"/>
+    <w:lsdException w:unhideWhenUsed="0" w:uiPriority="67" w:semiHidden="0" w:name="Medium Grid 1 Accent 6"/>
+    <w:lsdException w:unhideWhenUsed="0" w:uiPriority="68" w:semiHidden="0" w:name="Medium Grid 2 Accent 6"/>
+    <w:lsdException w:unhideWhenUsed="0" w:uiPriority="69" w:semiHidden="0" w:name="Medium Grid 3 Accent 6"/>
+    <w:lsdException w:unhideWhenUsed="0" w:uiPriority="70" w:semiHidden="0" w:name="Dark List Accent 6"/>
+    <w:lsdException w:unhideWhenUsed="0" w:uiPriority="71" w:semiHidden="0" w:name="Colorful Shading Accent 6"/>
+    <w:lsdException w:unhideWhenUsed="0" w:uiPriority="72" w:semiHidden="0" w:name="Colorful List Accent 6"/>
+    <w:lsdException w:unhideWhenUsed="0" w:uiPriority="73" w:semiHidden="0" w:name="Colorful Grid Accent 6"/>
   </w:latentStyles>
-  <w:style w:type="paragraph" w:default="1" w:styleId="Normal">
+  <w:style w:type="paragraph" w:default="1" w:styleId="1">
     <w:name w:val="Normal"/>
     <w:qFormat/>
-    <w:rsid w:val="00C84A3F"/>
+    <w:uiPriority w:val="0"/>
     <w:pPr>
       <w:spacing w:after="160" w:line="278" w:lineRule="auto"/>
     </w:pPr>
     <w:rPr>
-      <w:rFonts w:asciiTheme="minorHAnsi" w:eastAsiaTheme="minorHAnsi" w:hAnsiTheme="minorHAnsi" w:cstheme="minorBidi"/>
+      <w:rFonts w:asciiTheme="minorHAnsi" w:hAnsiTheme="minorHAnsi" w:eastAsiaTheme="minorHAnsi" w:cstheme="minorBidi"/>
       <w:kern w:val="2"/>
       <w:sz w:val="24"/>
       <w:szCs w:val="24"/>
-      <w:lang w:eastAsia="en-US"/>
+      <w:lang w:val="en-IN" w:eastAsia="en-US" w:bidi="ar-SA"/>
       <w14:ligatures w14:val="standardContextual"/>
     </w:rPr>
   </w:style>
-  <w:style w:type="paragraph" w:styleId="Heading1">
+  <w:style w:type="paragraph" w:styleId="2">
     <w:name w:val="heading 1"/>
-    <w:basedOn w:val="Normal"/>
-    <w:next w:val="Normal"/>
-    <w:link w:val="Heading1Char"/>
+    <w:basedOn w:val="1"/>
+    <w:next w:val="1"/>
+    <w:link w:val="24"/>
+    <w:qFormat/>
     <w:uiPriority w:val="9"/>
-    <w:qFormat/>
     <w:pPr>
       <w:keepNext/>
       <w:keepLines/>
@@ -2323,21 +2104,21 @@
       <w:outlineLvl w:val="0"/>
     </w:pPr>
     <w:rPr>
-      <w:rFonts w:asciiTheme="majorHAnsi" w:eastAsiaTheme="majorEastAsia" w:hAnsiTheme="majorHAnsi" w:cstheme="majorBidi"/>
-      <w:color w:val="0F4761" w:themeColor="accent1" w:themeShade="BF"/>
+      <w:rFonts w:asciiTheme="majorHAnsi" w:hAnsiTheme="majorHAnsi" w:eastAsiaTheme="majorEastAsia" w:cstheme="majorBidi"/>
+      <w:color w:val="104862" w:themeColor="accent1" w:themeShade="BF"/>
       <w:sz w:val="40"/>
       <w:szCs w:val="40"/>
     </w:rPr>
   </w:style>
-  <w:style w:type="paragraph" w:styleId="Heading2">
+  <w:style w:type="paragraph" w:styleId="3">
     <w:name w:val="heading 2"/>
-    <w:basedOn w:val="Normal"/>
-    <w:next w:val="Normal"/>
-    <w:link w:val="Heading2Char"/>
-    <w:uiPriority w:val="9"/>
+    <w:basedOn w:val="1"/>
+    <w:next w:val="1"/>
+    <w:link w:val="25"/>
     <w:semiHidden/>
     <w:unhideWhenUsed/>
     <w:qFormat/>
+    <w:uiPriority w:val="9"/>
     <w:pPr>
       <w:keepNext/>
       <w:keepLines/>
@@ -2345,21 +2126,21 @@
       <w:outlineLvl w:val="1"/>
     </w:pPr>
     <w:rPr>
-      <w:rFonts w:asciiTheme="majorHAnsi" w:eastAsiaTheme="majorEastAsia" w:hAnsiTheme="majorHAnsi" w:cstheme="majorBidi"/>
-      <w:color w:val="0F4761" w:themeColor="accent1" w:themeShade="BF"/>
+      <w:rFonts w:asciiTheme="majorHAnsi" w:hAnsiTheme="majorHAnsi" w:eastAsiaTheme="majorEastAsia" w:cstheme="majorBidi"/>
+      <w:color w:val="104862" w:themeColor="accent1" w:themeShade="BF"/>
       <w:sz w:val="32"/>
       <w:szCs w:val="32"/>
     </w:rPr>
   </w:style>
-  <w:style w:type="paragraph" w:styleId="Heading3">
+  <w:style w:type="paragraph" w:styleId="4">
     <w:name w:val="heading 3"/>
-    <w:basedOn w:val="Normal"/>
-    <w:next w:val="Normal"/>
-    <w:link w:val="Heading3Char"/>
-    <w:uiPriority w:val="9"/>
+    <w:basedOn w:val="1"/>
+    <w:next w:val="1"/>
+    <w:link w:val="26"/>
     <w:semiHidden/>
     <w:unhideWhenUsed/>
     <w:qFormat/>
+    <w:uiPriority w:val="9"/>
     <w:pPr>
       <w:keepNext/>
       <w:keepLines/>
@@ -2368,20 +2149,20 @@
     </w:pPr>
     <w:rPr>
       <w:rFonts w:eastAsiaTheme="majorEastAsia" w:cstheme="majorBidi"/>
-      <w:color w:val="0F4761" w:themeColor="accent1" w:themeShade="BF"/>
+      <w:color w:val="104862" w:themeColor="accent1" w:themeShade="BF"/>
       <w:sz w:val="28"/>
       <w:szCs w:val="28"/>
     </w:rPr>
   </w:style>
-  <w:style w:type="paragraph" w:styleId="Heading4">
+  <w:style w:type="paragraph" w:styleId="5">
     <w:name w:val="heading 4"/>
-    <w:basedOn w:val="Normal"/>
-    <w:next w:val="Normal"/>
-    <w:link w:val="Heading4Char"/>
-    <w:uiPriority w:val="9"/>
+    <w:basedOn w:val="1"/>
+    <w:next w:val="1"/>
+    <w:link w:val="27"/>
     <w:semiHidden/>
     <w:unhideWhenUsed/>
     <w:qFormat/>
+    <w:uiPriority w:val="9"/>
     <w:pPr>
       <w:keepNext/>
       <w:keepLines/>
@@ -2392,18 +2173,18 @@
       <w:rFonts w:eastAsiaTheme="majorEastAsia" w:cstheme="majorBidi"/>
       <w:i/>
       <w:iCs/>
-      <w:color w:val="0F4761" w:themeColor="accent1" w:themeShade="BF"/>
-    </w:rPr>
-  </w:style>
-  <w:style w:type="paragraph" w:styleId="Heading5">
+      <w:color w:val="104862" w:themeColor="accent1" w:themeShade="BF"/>
+    </w:rPr>
+  </w:style>
+  <w:style w:type="paragraph" w:styleId="6">
     <w:name w:val="heading 5"/>
-    <w:basedOn w:val="Normal"/>
-    <w:next w:val="Normal"/>
-    <w:link w:val="Heading5Char"/>
-    <w:uiPriority w:val="9"/>
+    <w:basedOn w:val="1"/>
+    <w:next w:val="1"/>
+    <w:link w:val="28"/>
     <w:semiHidden/>
     <w:unhideWhenUsed/>
     <w:qFormat/>
+    <w:uiPriority w:val="9"/>
     <w:pPr>
       <w:keepNext/>
       <w:keepLines/>
@@ -2412,18 +2193,18 @@
     </w:pPr>
     <w:rPr>
       <w:rFonts w:eastAsiaTheme="majorEastAsia" w:cstheme="majorBidi"/>
-      <w:color w:val="0F4761" w:themeColor="accent1" w:themeShade="BF"/>
-    </w:rPr>
-  </w:style>
-  <w:style w:type="paragraph" w:styleId="Heading6">
+      <w:color w:val="104862" w:themeColor="accent1" w:themeShade="BF"/>
+    </w:rPr>
+  </w:style>
+  <w:style w:type="paragraph" w:styleId="7">
     <w:name w:val="heading 6"/>
-    <w:basedOn w:val="Normal"/>
-    <w:next w:val="Normal"/>
-    <w:link w:val="Heading6Char"/>
-    <w:uiPriority w:val="9"/>
+    <w:basedOn w:val="1"/>
+    <w:next w:val="1"/>
+    <w:link w:val="29"/>
     <w:semiHidden/>
     <w:unhideWhenUsed/>
     <w:qFormat/>
+    <w:uiPriority w:val="9"/>
     <w:pPr>
       <w:keepNext/>
       <w:keepLines/>
@@ -2435,17 +2216,25 @@
       <w:i/>
       <w:iCs/>
       <w:color w:val="595959" w:themeColor="text1" w:themeTint="A6"/>
-    </w:rPr>
-  </w:style>
-  <w:style w:type="paragraph" w:styleId="Heading7">
+      <w14:textFill>
+        <w14:solidFill>
+          <w14:schemeClr w14:val="tx1">
+            <w14:lumMod w14:val="65000"/>
+            <w14:lumOff w14:val="35000"/>
+          </w14:schemeClr>
+        </w14:solidFill>
+      </w14:textFill>
+    </w:rPr>
+  </w:style>
+  <w:style w:type="paragraph" w:styleId="8">
     <w:name w:val="heading 7"/>
-    <w:basedOn w:val="Normal"/>
-    <w:next w:val="Normal"/>
-    <w:link w:val="Heading7Char"/>
-    <w:uiPriority w:val="9"/>
+    <w:basedOn w:val="1"/>
+    <w:next w:val="1"/>
+    <w:link w:val="30"/>
     <w:semiHidden/>
     <w:unhideWhenUsed/>
     <w:qFormat/>
+    <w:uiPriority w:val="9"/>
     <w:pPr>
       <w:keepNext/>
       <w:keepLines/>
@@ -2455,17 +2244,25 @@
     <w:rPr>
       <w:rFonts w:eastAsiaTheme="majorEastAsia" w:cstheme="majorBidi"/>
       <w:color w:val="595959" w:themeColor="text1" w:themeTint="A6"/>
-    </w:rPr>
-  </w:style>
-  <w:style w:type="paragraph" w:styleId="Heading8">
+      <w14:textFill>
+        <w14:solidFill>
+          <w14:schemeClr w14:val="tx1">
+            <w14:lumMod w14:val="65000"/>
+            <w14:lumOff w14:val="35000"/>
+          </w14:schemeClr>
+        </w14:solidFill>
+      </w14:textFill>
+    </w:rPr>
+  </w:style>
+  <w:style w:type="paragraph" w:styleId="9">
     <w:name w:val="heading 8"/>
-    <w:basedOn w:val="Normal"/>
-    <w:next w:val="Normal"/>
-    <w:link w:val="Heading8Char"/>
-    <w:uiPriority w:val="9"/>
+    <w:basedOn w:val="1"/>
+    <w:next w:val="1"/>
+    <w:link w:val="31"/>
     <w:semiHidden/>
     <w:unhideWhenUsed/>
     <w:qFormat/>
+    <w:uiPriority w:val="9"/>
     <w:pPr>
       <w:keepNext/>
       <w:keepLines/>
@@ -2477,17 +2274,25 @@
       <w:i/>
       <w:iCs/>
       <w:color w:val="262626" w:themeColor="text1" w:themeTint="D9"/>
-    </w:rPr>
-  </w:style>
-  <w:style w:type="paragraph" w:styleId="Heading9">
+      <w14:textFill>
+        <w14:solidFill>
+          <w14:schemeClr w14:val="tx1">
+            <w14:lumMod w14:val="85000"/>
+            <w14:lumOff w14:val="15000"/>
+          </w14:schemeClr>
+        </w14:solidFill>
+      </w14:textFill>
+    </w:rPr>
+  </w:style>
+  <w:style w:type="paragraph" w:styleId="10">
     <w:name w:val="heading 9"/>
-    <w:basedOn w:val="Normal"/>
-    <w:next w:val="Normal"/>
-    <w:link w:val="Heading9Char"/>
-    <w:uiPriority w:val="9"/>
+    <w:basedOn w:val="1"/>
+    <w:next w:val="1"/>
+    <w:link w:val="32"/>
     <w:semiHidden/>
     <w:unhideWhenUsed/>
     <w:qFormat/>
+    <w:uiPriority w:val="9"/>
     <w:pPr>
       <w:keepNext/>
       <w:keepLines/>
@@ -2497,20 +2302,30 @@
     <w:rPr>
       <w:rFonts w:eastAsiaTheme="majorEastAsia" w:cstheme="majorBidi"/>
       <w:color w:val="262626" w:themeColor="text1" w:themeTint="D9"/>
-    </w:rPr>
-  </w:style>
-  <w:style w:type="character" w:default="1" w:styleId="DefaultParagraphFont">
+      <w14:textFill>
+        <w14:solidFill>
+          <w14:schemeClr w14:val="tx1">
+            <w14:lumMod w14:val="85000"/>
+            <w14:lumOff w14:val="15000"/>
+          </w14:schemeClr>
+        </w14:solidFill>
+      </w14:textFill>
+    </w:rPr>
+  </w:style>
+  <w:style w:type="character" w:default="1" w:styleId="11">
     <w:name w:val="Default Paragraph Font"/>
-    <w:uiPriority w:val="1"/>
-    <w:unhideWhenUsed/>
-  </w:style>
-  <w:style w:type="table" w:default="1" w:styleId="TableNormal">
-    <w:name w:val="Normal Table"/>
-    <w:uiPriority w:val="99"/>
     <w:semiHidden/>
     <w:unhideWhenUsed/>
+    <w:qFormat/>
+    <w:uiPriority w:val="1"/>
+  </w:style>
+  <w:style w:type="table" w:default="1" w:styleId="12">
+    <w:name w:val="Normal Table"/>
+    <w:semiHidden/>
+    <w:unhideWhenUsed/>
+    <w:qFormat/>
+    <w:uiPriority w:val="99"/>
     <w:tblPr>
-      <w:tblInd w:w="0" w:type="dxa"/>
       <w:tblCellMar>
         <w:top w:w="0" w:type="dxa"/>
         <w:left w:w="108" w:type="dxa"/>
@@ -2519,42 +2334,36 @@
       </w:tblCellMar>
     </w:tblPr>
   </w:style>
-  <w:style w:type="numbering" w:default="1" w:styleId="NoList">
-    <w:name w:val="No List"/>
-    <w:uiPriority w:val="99"/>
+  <w:style w:type="paragraph" w:styleId="13">
+    <w:name w:val="Body Text"/>
+    <w:basedOn w:val="1"/>
+    <w:qFormat/>
+    <w:uiPriority w:val="1"/>
+    <w:rPr>
+      <w:rFonts w:ascii="Times New Roman" w:hAnsi="Times New Roman" w:eastAsia="Times New Roman" w:cs="Times New Roman"/>
+      <w:lang w:val="en-US"/>
+    </w:rPr>
+  </w:style>
+  <w:style w:type="character" w:styleId="14">
+    <w:name w:val="annotation reference"/>
+    <w:basedOn w:val="11"/>
     <w:semiHidden/>
     <w:unhideWhenUsed/>
-  </w:style>
-  <w:style w:type="paragraph" w:styleId="BodyText">
-    <w:name w:val="Body Text"/>
-    <w:basedOn w:val="Normal"/>
-    <w:uiPriority w:val="1"/>
-    <w:qFormat/>
-    <w:rPr>
-      <w:rFonts w:ascii="Times New Roman" w:eastAsia="Times New Roman" w:hAnsi="Times New Roman" w:cs="Times New Roman"/>
-      <w:lang w:val="en-US"/>
-    </w:rPr>
-  </w:style>
-  <w:style w:type="character" w:styleId="CommentReference">
-    <w:name w:val="annotation reference"/>
-    <w:basedOn w:val="DefaultParagraphFont"/>
+    <w:qFormat/>
     <w:uiPriority w:val="99"/>
+    <w:rPr>
+      <w:sz w:val="16"/>
+      <w:szCs w:val="16"/>
+    </w:rPr>
+  </w:style>
+  <w:style w:type="paragraph" w:styleId="15">
+    <w:name w:val="annotation text"/>
+    <w:basedOn w:val="1"/>
+    <w:link w:val="44"/>
     <w:semiHidden/>
     <w:unhideWhenUsed/>
     <w:qFormat/>
-    <w:rPr>
-      <w:sz w:val="16"/>
-      <w:szCs w:val="16"/>
-    </w:rPr>
-  </w:style>
-  <w:style w:type="paragraph" w:styleId="CommentText">
-    <w:name w:val="annotation text"/>
-    <w:basedOn w:val="Normal"/>
-    <w:link w:val="CommentTextChar"/>
     <w:uiPriority w:val="99"/>
-    <w:semiHidden/>
-    <w:unhideWhenUsed/>
-    <w:qFormat/>
     <w:pPr>
       <w:spacing w:line="240" w:lineRule="auto"/>
     </w:pPr>
@@ -2563,27 +2372,27 @@
       <w:szCs w:val="20"/>
     </w:rPr>
   </w:style>
-  <w:style w:type="paragraph" w:styleId="CommentSubject">
+  <w:style w:type="paragraph" w:styleId="16">
     <w:name w:val="annotation subject"/>
-    <w:basedOn w:val="CommentText"/>
-    <w:next w:val="CommentText"/>
-    <w:link w:val="CommentSubjectChar"/>
-    <w:uiPriority w:val="99"/>
+    <w:basedOn w:val="15"/>
+    <w:next w:val="15"/>
+    <w:link w:val="45"/>
     <w:semiHidden/>
     <w:unhideWhenUsed/>
     <w:qFormat/>
+    <w:uiPriority w:val="99"/>
     <w:rPr>
       <w:b/>
       <w:bCs/>
     </w:rPr>
   </w:style>
-  <w:style w:type="paragraph" w:styleId="Footer">
+  <w:style w:type="paragraph" w:styleId="17">
     <w:name w:val="footer"/>
-    <w:basedOn w:val="Normal"/>
-    <w:link w:val="FooterChar"/>
+    <w:basedOn w:val="1"/>
+    <w:link w:val="43"/>
+    <w:unhideWhenUsed/>
+    <w:qFormat/>
     <w:uiPriority w:val="99"/>
-    <w:unhideWhenUsed/>
-    <w:qFormat/>
     <w:pPr>
       <w:tabs>
         <w:tab w:val="center" w:pos="4513"/>
@@ -2592,13 +2401,13 @@
       <w:spacing w:after="0" w:line="240" w:lineRule="auto"/>
     </w:pPr>
   </w:style>
-  <w:style w:type="paragraph" w:styleId="Header">
+  <w:style w:type="paragraph" w:styleId="18">
     <w:name w:val="header"/>
-    <w:basedOn w:val="Normal"/>
-    <w:link w:val="HeaderChar"/>
+    <w:basedOn w:val="1"/>
+    <w:link w:val="42"/>
+    <w:unhideWhenUsed/>
+    <w:qFormat/>
     <w:uiPriority w:val="99"/>
-    <w:unhideWhenUsed/>
-    <w:qFormat/>
     <w:pPr>
       <w:tabs>
         <w:tab w:val="center" w:pos="4513"/>
@@ -2607,231 +2416,285 @@
       <w:spacing w:after="0" w:line="240" w:lineRule="auto"/>
     </w:pPr>
   </w:style>
-  <w:style w:type="character" w:styleId="Hyperlink">
+  <w:style w:type="character" w:styleId="19">
     <w:name w:val="Hyperlink"/>
-    <w:basedOn w:val="DefaultParagraphFont"/>
+    <w:basedOn w:val="11"/>
+    <w:unhideWhenUsed/>
+    <w:qFormat/>
     <w:uiPriority w:val="99"/>
-    <w:unhideWhenUsed/>
-    <w:qFormat/>
     <w:rPr>
       <w:color w:val="467886" w:themeColor="hyperlink"/>
       <w:u w:val="single"/>
-    </w:rPr>
-  </w:style>
-  <w:style w:type="paragraph" w:styleId="NormalWeb">
+      <w14:textFill>
+        <w14:solidFill>
+          <w14:schemeClr w14:val="hlink"/>
+        </w14:solidFill>
+      </w14:textFill>
+    </w:rPr>
+  </w:style>
+  <w:style w:type="paragraph" w:styleId="20">
     <w:name w:val="Normal (Web)"/>
-    <w:basedOn w:val="Normal"/>
-    <w:uiPriority w:val="99"/>
+    <w:basedOn w:val="1"/>
     <w:semiHidden/>
     <w:unhideWhenUsed/>
     <w:qFormat/>
+    <w:uiPriority w:val="99"/>
     <w:pPr>
       <w:spacing w:before="100" w:beforeAutospacing="1" w:after="100" w:afterAutospacing="1" w:line="240" w:lineRule="auto"/>
     </w:pPr>
     <w:rPr>
-      <w:rFonts w:ascii="Times New Roman" w:eastAsia="Times New Roman" w:hAnsi="Times New Roman" w:cs="Times New Roman"/>
+      <w:rFonts w:ascii="Times New Roman" w:hAnsi="Times New Roman" w:eastAsia="Times New Roman" w:cs="Times New Roman"/>
       <w:kern w:val="0"/>
       <w:lang w:eastAsia="en-IN"/>
       <w14:ligatures w14:val="none"/>
     </w:rPr>
   </w:style>
-  <w:style w:type="character" w:styleId="Strong">
+  <w:style w:type="character" w:styleId="21">
     <w:name w:val="Strong"/>
-    <w:basedOn w:val="DefaultParagraphFont"/>
-    <w:qFormat/>
+    <w:basedOn w:val="11"/>
+    <w:qFormat/>
+    <w:uiPriority w:val="0"/>
     <w:rPr>
       <w:b/>
       <w:bCs/>
     </w:rPr>
   </w:style>
-  <w:style w:type="paragraph" w:styleId="Subtitle">
+  <w:style w:type="paragraph" w:styleId="22">
     <w:name w:val="Subtitle"/>
-    <w:basedOn w:val="Normal"/>
-    <w:next w:val="Normal"/>
-    <w:link w:val="SubtitleChar"/>
+    <w:basedOn w:val="1"/>
+    <w:next w:val="1"/>
+    <w:link w:val="34"/>
+    <w:qFormat/>
     <w:uiPriority w:val="11"/>
-    <w:qFormat/>
     <w:rPr>
       <w:rFonts w:eastAsiaTheme="majorEastAsia" w:cstheme="majorBidi"/>
       <w:color w:val="595959" w:themeColor="text1" w:themeTint="A6"/>
       <w:spacing w:val="15"/>
       <w:sz w:val="28"/>
       <w:szCs w:val="28"/>
-    </w:rPr>
-  </w:style>
-  <w:style w:type="paragraph" w:styleId="Title">
+      <w14:textFill>
+        <w14:solidFill>
+          <w14:schemeClr w14:val="tx1">
+            <w14:lumMod w14:val="65000"/>
+            <w14:lumOff w14:val="35000"/>
+          </w14:schemeClr>
+        </w14:solidFill>
+      </w14:textFill>
+    </w:rPr>
+  </w:style>
+  <w:style w:type="paragraph" w:styleId="23">
     <w:name w:val="Title"/>
-    <w:basedOn w:val="Normal"/>
-    <w:next w:val="Normal"/>
-    <w:link w:val="TitleChar"/>
+    <w:basedOn w:val="1"/>
+    <w:next w:val="1"/>
+    <w:link w:val="33"/>
+    <w:qFormat/>
     <w:uiPriority w:val="10"/>
-    <w:qFormat/>
     <w:pPr>
       <w:spacing w:after="80" w:line="240" w:lineRule="auto"/>
       <w:contextualSpacing/>
     </w:pPr>
     <w:rPr>
-      <w:rFonts w:asciiTheme="majorHAnsi" w:eastAsiaTheme="majorEastAsia" w:hAnsiTheme="majorHAnsi" w:cstheme="majorBidi"/>
+      <w:rFonts w:asciiTheme="majorHAnsi" w:hAnsiTheme="majorHAnsi" w:eastAsiaTheme="majorEastAsia" w:cstheme="majorBidi"/>
       <w:spacing w:val="-10"/>
       <w:kern w:val="28"/>
       <w:sz w:val="56"/>
       <w:szCs w:val="56"/>
     </w:rPr>
   </w:style>
-  <w:style w:type="character" w:customStyle="1" w:styleId="Heading1Char">
+  <w:style w:type="character" w:customStyle="1" w:styleId="24">
     <w:name w:val="Heading 1 Char"/>
-    <w:basedOn w:val="DefaultParagraphFont"/>
-    <w:link w:val="Heading1"/>
+    <w:basedOn w:val="11"/>
+    <w:link w:val="2"/>
+    <w:qFormat/>
     <w:uiPriority w:val="9"/>
-    <w:qFormat/>
-    <w:rPr>
-      <w:rFonts w:asciiTheme="majorHAnsi" w:eastAsiaTheme="majorEastAsia" w:hAnsiTheme="majorHAnsi" w:cstheme="majorBidi"/>
-      <w:color w:val="0F4761" w:themeColor="accent1" w:themeShade="BF"/>
+    <w:rPr>
+      <w:rFonts w:asciiTheme="majorHAnsi" w:hAnsiTheme="majorHAnsi" w:eastAsiaTheme="majorEastAsia" w:cstheme="majorBidi"/>
+      <w:color w:val="104862" w:themeColor="accent1" w:themeShade="BF"/>
       <w:sz w:val="40"/>
       <w:szCs w:val="40"/>
     </w:rPr>
   </w:style>
-  <w:style w:type="character" w:customStyle="1" w:styleId="Heading2Char">
+  <w:style w:type="character" w:customStyle="1" w:styleId="25">
     <w:name w:val="Heading 2 Char"/>
-    <w:basedOn w:val="DefaultParagraphFont"/>
-    <w:link w:val="Heading2"/>
+    <w:basedOn w:val="11"/>
+    <w:link w:val="3"/>
+    <w:semiHidden/>
+    <w:qFormat/>
     <w:uiPriority w:val="9"/>
-    <w:semiHidden/>
-    <w:qFormat/>
-    <w:rPr>
-      <w:rFonts w:asciiTheme="majorHAnsi" w:eastAsiaTheme="majorEastAsia" w:hAnsiTheme="majorHAnsi" w:cstheme="majorBidi"/>
-      <w:color w:val="0F4761" w:themeColor="accent1" w:themeShade="BF"/>
+    <w:rPr>
+      <w:rFonts w:asciiTheme="majorHAnsi" w:hAnsiTheme="majorHAnsi" w:eastAsiaTheme="majorEastAsia" w:cstheme="majorBidi"/>
+      <w:color w:val="104862" w:themeColor="accent1" w:themeShade="BF"/>
       <w:sz w:val="32"/>
       <w:szCs w:val="32"/>
     </w:rPr>
   </w:style>
-  <w:style w:type="character" w:customStyle="1" w:styleId="Heading3Char">
+  <w:style w:type="character" w:customStyle="1" w:styleId="26">
     <w:name w:val="Heading 3 Char"/>
-    <w:basedOn w:val="DefaultParagraphFont"/>
-    <w:link w:val="Heading3"/>
+    <w:basedOn w:val="11"/>
+    <w:link w:val="4"/>
+    <w:semiHidden/>
+    <w:qFormat/>
     <w:uiPriority w:val="9"/>
-    <w:semiHidden/>
-    <w:qFormat/>
     <w:rPr>
       <w:rFonts w:eastAsiaTheme="majorEastAsia" w:cstheme="majorBidi"/>
-      <w:color w:val="0F4761" w:themeColor="accent1" w:themeShade="BF"/>
+      <w:color w:val="104862" w:themeColor="accent1" w:themeShade="BF"/>
       <w:sz w:val="28"/>
       <w:szCs w:val="28"/>
     </w:rPr>
   </w:style>
-  <w:style w:type="character" w:customStyle="1" w:styleId="Heading4Char">
+  <w:style w:type="character" w:customStyle="1" w:styleId="27">
     <w:name w:val="Heading 4 Char"/>
-    <w:basedOn w:val="DefaultParagraphFont"/>
-    <w:link w:val="Heading4"/>
+    <w:basedOn w:val="11"/>
+    <w:link w:val="5"/>
+    <w:semiHidden/>
+    <w:qFormat/>
     <w:uiPriority w:val="9"/>
-    <w:semiHidden/>
-    <w:qFormat/>
     <w:rPr>
       <w:rFonts w:eastAsiaTheme="majorEastAsia" w:cstheme="majorBidi"/>
       <w:i/>
       <w:iCs/>
-      <w:color w:val="0F4761" w:themeColor="accent1" w:themeShade="BF"/>
-    </w:rPr>
-  </w:style>
-  <w:style w:type="character" w:customStyle="1" w:styleId="Heading5Char">
+      <w:color w:val="104862" w:themeColor="accent1" w:themeShade="BF"/>
+    </w:rPr>
+  </w:style>
+  <w:style w:type="character" w:customStyle="1" w:styleId="28">
     <w:name w:val="Heading 5 Char"/>
-    <w:basedOn w:val="DefaultParagraphFont"/>
-    <w:link w:val="Heading5"/>
+    <w:basedOn w:val="11"/>
+    <w:link w:val="6"/>
+    <w:semiHidden/>
+    <w:qFormat/>
     <w:uiPriority w:val="9"/>
+    <w:rPr>
+      <w:rFonts w:eastAsiaTheme="majorEastAsia" w:cstheme="majorBidi"/>
+      <w:color w:val="104862" w:themeColor="accent1" w:themeShade="BF"/>
+    </w:rPr>
+  </w:style>
+  <w:style w:type="character" w:customStyle="1" w:styleId="29">
+    <w:name w:val="Heading 6 Char"/>
+    <w:basedOn w:val="11"/>
+    <w:link w:val="7"/>
     <w:semiHidden/>
     <w:qFormat/>
-    <w:rPr>
-      <w:rFonts w:eastAsiaTheme="majorEastAsia" w:cstheme="majorBidi"/>
-      <w:color w:val="0F4761" w:themeColor="accent1" w:themeShade="BF"/>
-    </w:rPr>
-  </w:style>
-  <w:style w:type="character" w:customStyle="1" w:styleId="Heading6Char">
-    <w:name w:val="Heading 6 Char"/>
-    <w:basedOn w:val="DefaultParagraphFont"/>
-    <w:link w:val="Heading6"/>
     <w:uiPriority w:val="9"/>
-    <w:semiHidden/>
-    <w:qFormat/>
     <w:rPr>
       <w:rFonts w:eastAsiaTheme="majorEastAsia" w:cstheme="majorBidi"/>
       <w:i/>
       <w:iCs/>
       <w:color w:val="595959" w:themeColor="text1" w:themeTint="A6"/>
-    </w:rPr>
-  </w:style>
-  <w:style w:type="character" w:customStyle="1" w:styleId="Heading7Char">
+      <w14:textFill>
+        <w14:solidFill>
+          <w14:schemeClr w14:val="tx1">
+            <w14:lumMod w14:val="65000"/>
+            <w14:lumOff w14:val="35000"/>
+          </w14:schemeClr>
+        </w14:solidFill>
+      </w14:textFill>
+    </w:rPr>
+  </w:style>
+  <w:style w:type="character" w:customStyle="1" w:styleId="30">
     <w:name w:val="Heading 7 Char"/>
-    <w:basedOn w:val="DefaultParagraphFont"/>
-    <w:link w:val="Heading7"/>
+    <w:basedOn w:val="11"/>
+    <w:link w:val="8"/>
+    <w:semiHidden/>
+    <w:qFormat/>
     <w:uiPriority w:val="9"/>
-    <w:semiHidden/>
-    <w:qFormat/>
     <w:rPr>
       <w:rFonts w:eastAsiaTheme="majorEastAsia" w:cstheme="majorBidi"/>
       <w:color w:val="595959" w:themeColor="text1" w:themeTint="A6"/>
-    </w:rPr>
-  </w:style>
-  <w:style w:type="character" w:customStyle="1" w:styleId="Heading8Char">
+      <w14:textFill>
+        <w14:solidFill>
+          <w14:schemeClr w14:val="tx1">
+            <w14:lumMod w14:val="65000"/>
+            <w14:lumOff w14:val="35000"/>
+          </w14:schemeClr>
+        </w14:solidFill>
+      </w14:textFill>
+    </w:rPr>
+  </w:style>
+  <w:style w:type="character" w:customStyle="1" w:styleId="31">
     <w:name w:val="Heading 8 Char"/>
-    <w:basedOn w:val="DefaultParagraphFont"/>
-    <w:link w:val="Heading8"/>
+    <w:basedOn w:val="11"/>
+    <w:link w:val="9"/>
+    <w:semiHidden/>
+    <w:qFormat/>
     <w:uiPriority w:val="9"/>
-    <w:semiHidden/>
-    <w:qFormat/>
     <w:rPr>
       <w:rFonts w:eastAsiaTheme="majorEastAsia" w:cstheme="majorBidi"/>
       <w:i/>
       <w:iCs/>
       <w:color w:val="262626" w:themeColor="text1" w:themeTint="D9"/>
-    </w:rPr>
-  </w:style>
-  <w:style w:type="character" w:customStyle="1" w:styleId="Heading9Char">
+      <w14:textFill>
+        <w14:solidFill>
+          <w14:schemeClr w14:val="tx1">
+            <w14:lumMod w14:val="85000"/>
+            <w14:lumOff w14:val="15000"/>
+          </w14:schemeClr>
+        </w14:solidFill>
+      </w14:textFill>
+    </w:rPr>
+  </w:style>
+  <w:style w:type="character" w:customStyle="1" w:styleId="32">
     <w:name w:val="Heading 9 Char"/>
-    <w:basedOn w:val="DefaultParagraphFont"/>
-    <w:link w:val="Heading9"/>
+    <w:basedOn w:val="11"/>
+    <w:link w:val="10"/>
+    <w:semiHidden/>
+    <w:qFormat/>
     <w:uiPriority w:val="9"/>
-    <w:semiHidden/>
-    <w:qFormat/>
     <w:rPr>
       <w:rFonts w:eastAsiaTheme="majorEastAsia" w:cstheme="majorBidi"/>
       <w:color w:val="262626" w:themeColor="text1" w:themeTint="D9"/>
-    </w:rPr>
-  </w:style>
-  <w:style w:type="character" w:customStyle="1" w:styleId="TitleChar">
+      <w14:textFill>
+        <w14:solidFill>
+          <w14:schemeClr w14:val="tx1">
+            <w14:lumMod w14:val="85000"/>
+            <w14:lumOff w14:val="15000"/>
+          </w14:schemeClr>
+        </w14:solidFill>
+      </w14:textFill>
+    </w:rPr>
+  </w:style>
+  <w:style w:type="character" w:customStyle="1" w:styleId="33">
     <w:name w:val="Title Char"/>
-    <w:basedOn w:val="DefaultParagraphFont"/>
-    <w:link w:val="Title"/>
+    <w:basedOn w:val="11"/>
+    <w:link w:val="23"/>
+    <w:qFormat/>
     <w:uiPriority w:val="10"/>
-    <w:qFormat/>
-    <w:rPr>
-      <w:rFonts w:asciiTheme="majorHAnsi" w:eastAsiaTheme="majorEastAsia" w:hAnsiTheme="majorHAnsi" w:cstheme="majorBidi"/>
+    <w:rPr>
+      <w:rFonts w:asciiTheme="majorHAnsi" w:hAnsiTheme="majorHAnsi" w:eastAsiaTheme="majorEastAsia" w:cstheme="majorBidi"/>
       <w:spacing w:val="-10"/>
       <w:kern w:val="28"/>
       <w:sz w:val="56"/>
       <w:szCs w:val="56"/>
     </w:rPr>
   </w:style>
-  <w:style w:type="character" w:customStyle="1" w:styleId="SubtitleChar">
+  <w:style w:type="character" w:customStyle="1" w:styleId="34">
     <w:name w:val="Subtitle Char"/>
-    <w:basedOn w:val="DefaultParagraphFont"/>
-    <w:link w:val="Subtitle"/>
+    <w:basedOn w:val="11"/>
+    <w:link w:val="22"/>
+    <w:qFormat/>
     <w:uiPriority w:val="11"/>
-    <w:qFormat/>
     <w:rPr>
       <w:rFonts w:eastAsiaTheme="majorEastAsia" w:cstheme="majorBidi"/>
       <w:color w:val="595959" w:themeColor="text1" w:themeTint="A6"/>
       <w:spacing w:val="15"/>
       <w:sz w:val="28"/>
       <w:szCs w:val="28"/>
-    </w:rPr>
-  </w:style>
-  <w:style w:type="paragraph" w:styleId="Quote">
+      <w14:textFill>
+        <w14:solidFill>
+          <w14:schemeClr w14:val="tx1">
+            <w14:lumMod w14:val="65000"/>
+            <w14:lumOff w14:val="35000"/>
+          </w14:schemeClr>
+        </w14:solidFill>
+      </w14:textFill>
+    </w:rPr>
+  </w:style>
+  <w:style w:type="paragraph" w:styleId="35">
     <w:name w:val="Quote"/>
-    <w:basedOn w:val="Normal"/>
-    <w:next w:val="Normal"/>
-    <w:link w:val="QuoteChar"/>
+    <w:basedOn w:val="1"/>
+    <w:next w:val="1"/>
+    <w:link w:val="36"/>
+    <w:qFormat/>
     <w:uiPriority w:val="29"/>
-    <w:qFormat/>
     <w:pPr>
       <w:spacing w:before="160"/>
       <w:jc w:val="center"/>
@@ -2840,52 +2703,68 @@
       <w:i/>
       <w:iCs/>
       <w:color w:val="404040" w:themeColor="text1" w:themeTint="BF"/>
-    </w:rPr>
-  </w:style>
-  <w:style w:type="character" w:customStyle="1" w:styleId="QuoteChar">
+      <w14:textFill>
+        <w14:solidFill>
+          <w14:schemeClr w14:val="tx1">
+            <w14:lumMod w14:val="75000"/>
+            <w14:lumOff w14:val="25000"/>
+          </w14:schemeClr>
+        </w14:solidFill>
+      </w14:textFill>
+    </w:rPr>
+  </w:style>
+  <w:style w:type="character" w:customStyle="1" w:styleId="36">
     <w:name w:val="Quote Char"/>
-    <w:basedOn w:val="DefaultParagraphFont"/>
-    <w:link w:val="Quote"/>
+    <w:basedOn w:val="11"/>
+    <w:link w:val="35"/>
+    <w:qFormat/>
     <w:uiPriority w:val="29"/>
-    <w:qFormat/>
     <w:rPr>
       <w:i/>
       <w:iCs/>
       <w:color w:val="404040" w:themeColor="text1" w:themeTint="BF"/>
-    </w:rPr>
-  </w:style>
-  <w:style w:type="paragraph" w:styleId="ListParagraph">
+      <w14:textFill>
+        <w14:solidFill>
+          <w14:schemeClr w14:val="tx1">
+            <w14:lumMod w14:val="75000"/>
+            <w14:lumOff w14:val="25000"/>
+          </w14:schemeClr>
+        </w14:solidFill>
+      </w14:textFill>
+    </w:rPr>
+  </w:style>
+  <w:style w:type="paragraph" w:styleId="37">
     <w:name w:val="List Paragraph"/>
-    <w:basedOn w:val="Normal"/>
+    <w:basedOn w:val="1"/>
+    <w:qFormat/>
     <w:uiPriority w:val="34"/>
-    <w:qFormat/>
     <w:pPr>
       <w:ind w:left="720"/>
       <w:contextualSpacing/>
     </w:pPr>
   </w:style>
-  <w:style w:type="character" w:customStyle="1" w:styleId="IntenseEmphasis1">
+  <w:style w:type="character" w:customStyle="1" w:styleId="38">
     <w:name w:val="Intense Emphasis1"/>
-    <w:basedOn w:val="DefaultParagraphFont"/>
+    <w:basedOn w:val="11"/>
+    <w:qFormat/>
     <w:uiPriority w:val="21"/>
-    <w:qFormat/>
     <w:rPr>
       <w:i/>
       <w:iCs/>
-      <w:color w:val="0F4761" w:themeColor="accent1" w:themeShade="BF"/>
-    </w:rPr>
-  </w:style>
-  <w:style w:type="paragraph" w:styleId="IntenseQuote">
+      <w:color w:val="104862" w:themeColor="accent1" w:themeShade="BF"/>
+    </w:rPr>
+  </w:style>
+  <w:style w:type="paragraph" w:styleId="39">
     <w:name w:val="Intense Quote"/>
-    <w:basedOn w:val="Normal"/>
-    <w:next w:val="Normal"/>
-    <w:link w:val="IntenseQuoteChar"/>
+    <w:basedOn w:val="1"/>
+    <w:next w:val="1"/>
+    <w:link w:val="40"/>
+    <w:qFormat/>
     <w:uiPriority w:val="30"/>
-    <w:qFormat/>
     <w:pPr>
       <w:pBdr>
-        <w:top w:val="single" w:sz="4" w:space="10" w:color="0F4761" w:themeColor="accent1" w:themeShade="BF"/>
-        <w:bottom w:val="single" w:sz="4" w:space="10" w:color="0F4761" w:themeColor="accent1" w:themeShade="BF"/>
+        <w:top w:val="single" w:color="0F4761" w:themeColor="accent1" w:themeShade="BF" w:sz="4" w:space="10"/>
+        <w:bottom w:val="single" w:color="0F4761" w:themeColor="accent1" w:themeShade="BF" w:sz="4" w:space="10"/>
       </w:pBdr>
       <w:spacing w:before="360" w:after="360"/>
       <w:ind w:left="864" w:right="864"/>
@@ -2894,67 +2773,67 @@
     <w:rPr>
       <w:i/>
       <w:iCs/>
-      <w:color w:val="0F4761" w:themeColor="accent1" w:themeShade="BF"/>
-    </w:rPr>
-  </w:style>
-  <w:style w:type="character" w:customStyle="1" w:styleId="IntenseQuoteChar">
+      <w:color w:val="104862" w:themeColor="accent1" w:themeShade="BF"/>
+    </w:rPr>
+  </w:style>
+  <w:style w:type="character" w:customStyle="1" w:styleId="40">
     <w:name w:val="Intense Quote Char"/>
-    <w:basedOn w:val="DefaultParagraphFont"/>
-    <w:link w:val="IntenseQuote"/>
+    <w:basedOn w:val="11"/>
+    <w:link w:val="39"/>
+    <w:qFormat/>
     <w:uiPriority w:val="30"/>
-    <w:qFormat/>
     <w:rPr>
       <w:i/>
       <w:iCs/>
-      <w:color w:val="0F4761" w:themeColor="accent1" w:themeShade="BF"/>
-    </w:rPr>
-  </w:style>
-  <w:style w:type="character" w:customStyle="1" w:styleId="IntenseReference1">
+      <w:color w:val="104862" w:themeColor="accent1" w:themeShade="BF"/>
+    </w:rPr>
+  </w:style>
+  <w:style w:type="character" w:customStyle="1" w:styleId="41">
     <w:name w:val="Intense Reference1"/>
-    <w:basedOn w:val="DefaultParagraphFont"/>
+    <w:basedOn w:val="11"/>
+    <w:qFormat/>
     <w:uiPriority w:val="32"/>
-    <w:qFormat/>
     <w:rPr>
       <w:b/>
       <w:bCs/>
       <w:smallCaps/>
-      <w:color w:val="0F4761" w:themeColor="accent1" w:themeShade="BF"/>
+      <w:color w:val="104862" w:themeColor="accent1" w:themeShade="BF"/>
       <w:spacing w:val="5"/>
     </w:rPr>
   </w:style>
-  <w:style w:type="character" w:customStyle="1" w:styleId="HeaderChar">
+  <w:style w:type="character" w:customStyle="1" w:styleId="42">
     <w:name w:val="Header Char"/>
-    <w:basedOn w:val="DefaultParagraphFont"/>
-    <w:link w:val="Header"/>
+    <w:basedOn w:val="11"/>
+    <w:link w:val="18"/>
+    <w:qFormat/>
     <w:uiPriority w:val="99"/>
-    <w:qFormat/>
-  </w:style>
-  <w:style w:type="character" w:customStyle="1" w:styleId="FooterChar">
+  </w:style>
+  <w:style w:type="character" w:customStyle="1" w:styleId="43">
     <w:name w:val="Footer Char"/>
-    <w:basedOn w:val="DefaultParagraphFont"/>
-    <w:link w:val="Footer"/>
+    <w:basedOn w:val="11"/>
+    <w:link w:val="17"/>
+    <w:qFormat/>
     <w:uiPriority w:val="99"/>
-    <w:qFormat/>
-  </w:style>
-  <w:style w:type="character" w:customStyle="1" w:styleId="CommentTextChar">
+  </w:style>
+  <w:style w:type="character" w:customStyle="1" w:styleId="44">
     <w:name w:val="Comment Text Char"/>
-    <w:basedOn w:val="DefaultParagraphFont"/>
-    <w:link w:val="CommentText"/>
+    <w:basedOn w:val="11"/>
+    <w:link w:val="15"/>
+    <w:semiHidden/>
+    <w:qFormat/>
     <w:uiPriority w:val="99"/>
-    <w:semiHidden/>
-    <w:qFormat/>
     <w:rPr>
       <w:sz w:val="20"/>
       <w:szCs w:val="20"/>
     </w:rPr>
   </w:style>
-  <w:style w:type="character" w:customStyle="1" w:styleId="CommentSubjectChar">
+  <w:style w:type="character" w:customStyle="1" w:styleId="45">
     <w:name w:val="Comment Subject Char"/>
-    <w:basedOn w:val="CommentTextChar"/>
-    <w:link w:val="CommentSubject"/>
+    <w:basedOn w:val="44"/>
+    <w:link w:val="16"/>
+    <w:semiHidden/>
+    <w:qFormat/>
     <w:uiPriority w:val="99"/>
-    <w:semiHidden/>
-    <w:qFormat/>
     <w:rPr>
       <w:b/>
       <w:bCs/>
@@ -2962,25 +2841,24 @@
       <w:szCs w:val="20"/>
     </w:rPr>
   </w:style>
-  <w:style w:type="character" w:customStyle="1" w:styleId="UnresolvedMention1">
+  <w:style w:type="character" w:customStyle="1" w:styleId="46">
     <w:name w:val="Unresolved Mention1"/>
-    <w:basedOn w:val="DefaultParagraphFont"/>
-    <w:uiPriority w:val="99"/>
+    <w:basedOn w:val="11"/>
     <w:semiHidden/>
     <w:unhideWhenUsed/>
     <w:qFormat/>
+    <w:uiPriority w:val="99"/>
     <w:rPr>
       <w:color w:val="605E5C"/>
       <w:shd w:val="clear" w:color="auto" w:fill="E1DFDD"/>
     </w:rPr>
   </w:style>
-  <w:style w:type="character" w:styleId="UnresolvedMention">
+  <w:style w:type="character" w:customStyle="1" w:styleId="47">
     <w:name w:val="Unresolved Mention"/>
-    <w:basedOn w:val="DefaultParagraphFont"/>
-    <w:uiPriority w:val="99"/>
+    <w:basedOn w:val="11"/>
     <w:semiHidden/>
     <w:unhideWhenUsed/>
-    <w:rsid w:val="000161EF"/>
+    <w:uiPriority w:val="99"/>
     <w:rPr>
       <w:color w:val="605E5C"/>
       <w:shd w:val="clear" w:color="auto" w:fill="E1DFDD"/>
@@ -3261,7 +3139,6 @@
       </a:style>
     </a:lnDef>
   </a:objectDefaults>
-  <a:extraClrSchemeLst/>
 </a:theme>
 </file>
 
@@ -3271,8 +3148,6 @@
 
 <file path=customXml/itemProps1.xml><?xml version="1.0" encoding="utf-8"?>
 <ds:datastoreItem xmlns:ds="http://schemas.openxmlformats.org/officeDocument/2006/customXml" ds:itemID="{B1B4BC4A-61D2-48B3-8D46-0D0A2D07B453}">
-  <ds:schemaRefs>
-    <ds:schemaRef ds:uri="http://schemas.openxmlformats.org/officeDocument/2006/bibliography"/>
-  </ds:schemaRefs>
+  <ds:schemaRefs/>
 </ds:datastoreItem>
 </file>
</xml_diff>